<commit_message>
updated documentation for ds benchmark and analysis
</commit_message>
<xml_diff>
--- a/docs/DataStructurePerformanceAnalysis.docx
+++ b/docs/DataStructurePerformanceAnalysis.docx
@@ -24,6 +24,9 @@
       </w:r>
     </w:p>
     <w:p>
+      <w:pPr>
+        <w:ind w:firstLine="720"/>
+      </w:pPr>
       <w:r>
         <w:t xml:space="preserve">The </w:t>
       </w:r>
@@ -34,6 +37,42 @@
       <w:proofErr w:type="spellEnd"/>
       <w:r>
         <w:t xml:space="preserve"> project demonstrates 4 traditional data structures and their analysis.</w:t>
+      </w:r>
+      <w:r>
+        <w:t xml:space="preserve"> The project uses </w:t>
+      </w:r>
+      <w:proofErr w:type="spellStart"/>
+      <w:r>
+        <w:t>DyanmicArray</w:t>
+      </w:r>
+      <w:proofErr w:type="spellEnd"/>
+      <w:r>
+        <w:t xml:space="preserve">, Stack, </w:t>
+      </w:r>
+      <w:proofErr w:type="spellStart"/>
+      <w:r>
+        <w:t>RingBufferQueue</w:t>
+      </w:r>
+      <w:proofErr w:type="spellEnd"/>
+      <w:r>
+        <w:t>, and HashSet classes to evaluate performance in Python.</w:t>
+      </w:r>
+      <w:r>
+        <w:t xml:space="preserve"> Implemented in </w:t>
+      </w:r>
+      <w:proofErr w:type="spellStart"/>
+      <w:r>
+        <w:t>MasterColorMixer</w:t>
+      </w:r>
+      <w:proofErr w:type="spellEnd"/>
+      <w:r>
+        <w:t xml:space="preserve"> are textbook examples of data structures with</w:t>
+      </w:r>
+      <w:r>
+        <w:t xml:space="preserve"> a theoretical</w:t>
+      </w:r>
+      <w:r>
+        <w:t xml:space="preserve"> performance metric that can be compared for real-world analysis.</w:t>
       </w:r>
     </w:p>
     <w:p>
@@ -41,49 +80,2080 @@
         <w:pStyle w:val="Heading2"/>
       </w:pPr>
       <w:r>
-        <w:t>Analysis</w:t>
+        <w:t>Expected Big-O Operations</w:t>
+      </w:r>
+    </w:p>
+    <w:p>
+      <w:r>
+        <w:tab/>
+        <w:t xml:space="preserve">The </w:t>
+      </w:r>
+      <w:proofErr w:type="spellStart"/>
+      <w:r>
+        <w:t>MasterColorMixer</w:t>
+      </w:r>
+      <w:proofErr w:type="spellEnd"/>
+      <w:r>
+        <w:t xml:space="preserve"> app will need to store colors while tracking unlocked colors, as well as support a way to quickly </w:t>
+      </w:r>
+      <w:proofErr w:type="gramStart"/>
+      <w:r>
+        <w:t>lookup</w:t>
+      </w:r>
+      <w:proofErr w:type="gramEnd"/>
+      <w:r>
+        <w:t xml:space="preserve"> color names. Data structures and their uses </w:t>
+      </w:r>
+      <w:proofErr w:type="gramStart"/>
+      <w:r>
+        <w:t>becomes</w:t>
+      </w:r>
+      <w:proofErr w:type="gramEnd"/>
+      <w:r>
+        <w:t xml:space="preserve"> very relevant to the project, so evaluating empirical results for each is a useful exercise. </w:t>
+      </w:r>
+      <w:r>
+        <w:t xml:space="preserve">See the Reference section in this document to see the textbook time complexity table I used to determine the expected measurements. </w:t>
+      </w:r>
+      <w:r>
+        <w:t>Below I show the expected time complexities for each data structure, and</w:t>
+      </w:r>
+      <w:r>
+        <w:t xml:space="preserve"> later I</w:t>
+      </w:r>
+      <w:r>
+        <w:t xml:space="preserve"> compare </w:t>
+      </w:r>
+      <w:r>
+        <w:t>the expected expenses</w:t>
+      </w:r>
+      <w:r>
+        <w:t xml:space="preserve"> to</w:t>
+      </w:r>
+      <w:r>
+        <w:t xml:space="preserve"> the empirical</w:t>
+      </w:r>
+      <w:r>
+        <w:t xml:space="preserve"> results</w:t>
+      </w:r>
+      <w:r>
+        <w:t xml:space="preserve"> found</w:t>
+      </w:r>
+      <w:r>
+        <w:t xml:space="preserve"> in the </w:t>
+      </w:r>
+      <w:proofErr w:type="spellStart"/>
+      <w:r>
+        <w:t>MasterColorMixer</w:t>
+      </w:r>
+      <w:proofErr w:type="spellEnd"/>
+      <w:r>
+        <w:t xml:space="preserve"> project. </w:t>
       </w:r>
     </w:p>
     <w:p>
       <w:pPr>
         <w:pStyle w:val="Heading3"/>
+        <w:jc w:val="center"/>
       </w:pPr>
       <w:r>
         <w:t>Dynamic Array</w:t>
+      </w:r>
+    </w:p>
+    <w:p>
+      <w:r>
+        <w:tab/>
+        <w:t xml:space="preserve">The </w:t>
+      </w:r>
+      <w:proofErr w:type="spellStart"/>
+      <w:r>
+        <w:t>DynamicArray</w:t>
+      </w:r>
+      <w:proofErr w:type="spellEnd"/>
+      <w:r>
+        <w:t xml:space="preserve"> class is a wrapper around Python’s list. This mirrors typical dynamic array </w:t>
+      </w:r>
+      <w:proofErr w:type="spellStart"/>
+      <w:r>
+        <w:t>behaviour</w:t>
+      </w:r>
+      <w:proofErr w:type="spellEnd"/>
+      <w:r>
+        <w:t xml:space="preserve"> found in OOP textbooks. </w:t>
+      </w:r>
+    </w:p>
+    <w:p>
+      <w:r>
+        <w:rPr>
+          <w:b/>
+          <w:bCs/>
+        </w:rPr>
+        <w:t>Append</w:t>
+      </w:r>
+      <w:r>
+        <w:rPr>
+          <w:b/>
+          <w:bCs/>
+        </w:rPr>
+        <w:t>(item)</w:t>
+      </w:r>
+      <w:r>
+        <w:rPr>
+          <w:b/>
+          <w:bCs/>
+        </w:rPr>
+        <w:t xml:space="preserve"> – </w:t>
+      </w:r>
+      <w:proofErr w:type="gramStart"/>
+      <w:r>
+        <w:rPr>
+          <w:b/>
+          <w:bCs/>
+        </w:rPr>
+        <w:t>O(</w:t>
+      </w:r>
+      <w:proofErr w:type="gramEnd"/>
+      <w:r>
+        <w:rPr>
+          <w:b/>
+          <w:bCs/>
+        </w:rPr>
+        <w:t>1) – Expected as Constant</w:t>
+      </w:r>
+      <w:r>
+        <w:rPr>
+          <w:b/>
+          <w:bCs/>
+        </w:rPr>
+        <w:t xml:space="preserve"> (Amortized)</w:t>
+      </w:r>
+      <w:r>
+        <w:t xml:space="preserve">: </w:t>
+      </w:r>
+      <w:r>
+        <w:t xml:space="preserve">Python’s list will occasionally resize by dedicating a larger memory block and copying the elements in the original list. This resizing action in Python should be linear, but </w:t>
+      </w:r>
+      <w:r>
+        <w:t xml:space="preserve">because resizing happens often (in the benchmark tests) and the growth is always by constant factor (10 to 20, 20 to 40, 40 to 80…) the </w:t>
+      </w:r>
+      <w:proofErr w:type="gramStart"/>
+      <w:r>
+        <w:t>long term</w:t>
+      </w:r>
+      <w:proofErr w:type="gramEnd"/>
+      <w:r>
+        <w:t xml:space="preserve"> cost is constant. </w:t>
+      </w:r>
+    </w:p>
+    <w:p>
+      <w:proofErr w:type="gramStart"/>
+      <w:r>
+        <w:rPr>
+          <w:b/>
+          <w:bCs/>
+        </w:rPr>
+        <w:t>Pop(</w:t>
+      </w:r>
+      <w:proofErr w:type="gramEnd"/>
+      <w:r>
+        <w:rPr>
+          <w:b/>
+          <w:bCs/>
+        </w:rPr>
+        <w:t xml:space="preserve">) – </w:t>
+      </w:r>
+      <w:proofErr w:type="gramStart"/>
+      <w:r>
+        <w:rPr>
+          <w:b/>
+          <w:bCs/>
+        </w:rPr>
+        <w:t>O(</w:t>
+      </w:r>
+      <w:proofErr w:type="gramEnd"/>
+      <w:r>
+        <w:rPr>
+          <w:b/>
+          <w:bCs/>
+        </w:rPr>
+        <w:t>1) – Expected as Constant:</w:t>
+      </w:r>
+      <w:r>
+        <w:t xml:space="preserve"> Popping an element at the end of a list does not require shifting data. Long-term </w:t>
+      </w:r>
+      <w:proofErr w:type="gramStart"/>
+      <w:r>
+        <w:t>cost is</w:t>
+      </w:r>
+      <w:proofErr w:type="gramEnd"/>
+      <w:r>
+        <w:t xml:space="preserve"> constant.</w:t>
       </w:r>
     </w:p>
     <w:p>
       <w:pPr>
         <w:pStyle w:val="Heading3"/>
+        <w:jc w:val="center"/>
       </w:pPr>
       <w:r>
         <w:t>Stack</w:t>
       </w:r>
+    </w:p>
+    <w:p>
+      <w:r>
+        <w:tab/>
+        <w:t xml:space="preserve">The Stack class is implemented as a Python list. </w:t>
+      </w:r>
+    </w:p>
+    <w:p>
+      <w:r>
+        <w:rPr>
+          <w:b/>
+          <w:bCs/>
+        </w:rPr>
+        <w:t>Push(item)</w:t>
+      </w:r>
+      <w:r>
+        <w:t xml:space="preserve"> </w:t>
+      </w:r>
+      <w:r>
+        <w:rPr>
+          <w:b/>
+          <w:bCs/>
+        </w:rPr>
+        <w:t xml:space="preserve">– </w:t>
+      </w:r>
+      <w:proofErr w:type="gramStart"/>
+      <w:r>
+        <w:rPr>
+          <w:b/>
+          <w:bCs/>
+        </w:rPr>
+        <w:t>O(</w:t>
+      </w:r>
+      <w:proofErr w:type="gramEnd"/>
+      <w:r>
+        <w:rPr>
+          <w:b/>
+          <w:bCs/>
+        </w:rPr>
+        <w:t>1) – Expected as Constant</w:t>
+      </w:r>
+      <w:r>
+        <w:rPr>
+          <w:b/>
+          <w:bCs/>
+        </w:rPr>
+        <w:t xml:space="preserve"> (Amortized)</w:t>
+      </w:r>
+      <w:r>
+        <w:t>: Python’s</w:t>
+      </w:r>
+      <w:r>
+        <w:t xml:space="preserve"> </w:t>
+      </w:r>
+      <w:proofErr w:type="spellStart"/>
+      <w:proofErr w:type="gramStart"/>
+      <w:r>
+        <w:t>list.append</w:t>
+      </w:r>
+      <w:proofErr w:type="spellEnd"/>
+      <w:proofErr w:type="gramEnd"/>
+    </w:p>
+    <w:p>
+      <w:proofErr w:type="gramStart"/>
+      <w:r>
+        <w:rPr>
+          <w:b/>
+          <w:bCs/>
+        </w:rPr>
+        <w:t>P</w:t>
+      </w:r>
+      <w:r>
+        <w:rPr>
+          <w:b/>
+          <w:bCs/>
+        </w:rPr>
+        <w:t>op</w:t>
+      </w:r>
+      <w:r>
+        <w:rPr>
+          <w:b/>
+          <w:bCs/>
+        </w:rPr>
+        <w:t>(</w:t>
+      </w:r>
+      <w:proofErr w:type="gramEnd"/>
+      <w:r>
+        <w:rPr>
+          <w:b/>
+          <w:bCs/>
+        </w:rPr>
+        <w:t>)</w:t>
+      </w:r>
+      <w:r>
+        <w:t xml:space="preserve"> </w:t>
+      </w:r>
+      <w:r>
+        <w:rPr>
+          <w:b/>
+          <w:bCs/>
+        </w:rPr>
+        <w:t xml:space="preserve">– </w:t>
+      </w:r>
+      <w:proofErr w:type="gramStart"/>
+      <w:r>
+        <w:rPr>
+          <w:b/>
+          <w:bCs/>
+        </w:rPr>
+        <w:t>O(</w:t>
+      </w:r>
+      <w:proofErr w:type="gramEnd"/>
+      <w:r>
+        <w:rPr>
+          <w:b/>
+          <w:bCs/>
+        </w:rPr>
+        <w:t xml:space="preserve">1) – Expected as </w:t>
+      </w:r>
+      <w:proofErr w:type="gramStart"/>
+      <w:r>
+        <w:rPr>
+          <w:b/>
+          <w:bCs/>
+        </w:rPr>
+        <w:t>Constant</w:t>
+      </w:r>
+      <w:r>
+        <w:rPr>
+          <w:b/>
+          <w:bCs/>
+        </w:rPr>
+        <w:t xml:space="preserve"> </w:t>
+      </w:r>
+      <w:r>
+        <w:t>:</w:t>
+      </w:r>
+      <w:proofErr w:type="gramEnd"/>
+      <w:r>
+        <w:t xml:space="preserve"> Python’s </w:t>
+      </w:r>
+      <w:proofErr w:type="spellStart"/>
+      <w:r>
+        <w:t>list.</w:t>
+      </w:r>
+      <w:r>
+        <w:t>pop</w:t>
+      </w:r>
+      <w:proofErr w:type="spellEnd"/>
     </w:p>
     <w:p>
       <w:pPr>
         <w:pStyle w:val="Heading3"/>
+        <w:jc w:val="center"/>
       </w:pPr>
       <w:r>
+        <w:lastRenderedPageBreak/>
         <w:t>Queue</w:t>
+      </w:r>
+    </w:p>
+    <w:p>
+      <w:r>
+        <w:tab/>
+        <w:t xml:space="preserve">The </w:t>
+      </w:r>
+      <w:proofErr w:type="spellStart"/>
+      <w:r>
+        <w:t>RingBufferQueue</w:t>
+      </w:r>
+      <w:proofErr w:type="spellEnd"/>
+      <w:r>
+        <w:t xml:space="preserve"> class uses a circular buffer, with a fixed initial capacity of 8, which doubles on overflow.</w:t>
+      </w:r>
+    </w:p>
+    <w:p>
+      <w:r>
+        <w:rPr>
+          <w:b/>
+          <w:bCs/>
+        </w:rPr>
+        <w:t>Enqueue</w:t>
+      </w:r>
+      <w:r>
+        <w:rPr>
+          <w:b/>
+          <w:bCs/>
+        </w:rPr>
+        <w:t>(item)</w:t>
+      </w:r>
+      <w:r>
+        <w:t xml:space="preserve"> </w:t>
+      </w:r>
+      <w:r>
+        <w:rPr>
+          <w:b/>
+          <w:bCs/>
+        </w:rPr>
+        <w:t xml:space="preserve">– </w:t>
+      </w:r>
+      <w:proofErr w:type="gramStart"/>
+      <w:r>
+        <w:rPr>
+          <w:b/>
+          <w:bCs/>
+        </w:rPr>
+        <w:t>O(</w:t>
+      </w:r>
+      <w:proofErr w:type="gramEnd"/>
+      <w:r>
+        <w:rPr>
+          <w:b/>
+          <w:bCs/>
+        </w:rPr>
+        <w:t>1) – Expected as Constant</w:t>
+      </w:r>
+      <w:r>
+        <w:rPr>
+          <w:b/>
+          <w:bCs/>
+        </w:rPr>
+        <w:t xml:space="preserve"> (Amortized)</w:t>
+      </w:r>
+      <w:r>
+        <w:t xml:space="preserve">: </w:t>
+      </w:r>
+      <w:r>
+        <w:t xml:space="preserve">This enqueue method is unlike most, because it does not only assign an element to the tail index. This method </w:t>
+      </w:r>
+      <w:proofErr w:type="gramStart"/>
+      <w:r>
+        <w:t>resizes</w:t>
+      </w:r>
+      <w:proofErr w:type="gramEnd"/>
+      <w:r>
+        <w:t xml:space="preserve"> to double capacity and requires copying O(n) items. This resize occurs infrequently, so I believe it does not impact the </w:t>
+      </w:r>
+      <w:proofErr w:type="gramStart"/>
+      <w:r>
+        <w:t>worst case</w:t>
+      </w:r>
+      <w:proofErr w:type="gramEnd"/>
+      <w:r>
+        <w:t xml:space="preserve"> scenario case.</w:t>
+      </w:r>
+    </w:p>
+    <w:p>
+      <w:proofErr w:type="gramStart"/>
+      <w:r>
+        <w:rPr>
+          <w:b/>
+          <w:bCs/>
+        </w:rPr>
+        <w:t>Dequeue</w:t>
+      </w:r>
+      <w:r>
+        <w:rPr>
+          <w:b/>
+          <w:bCs/>
+        </w:rPr>
+        <w:t>(</w:t>
+      </w:r>
+      <w:proofErr w:type="gramEnd"/>
+      <w:r>
+        <w:rPr>
+          <w:b/>
+          <w:bCs/>
+        </w:rPr>
+        <w:t>)</w:t>
+      </w:r>
+      <w:r>
+        <w:t xml:space="preserve"> </w:t>
+      </w:r>
+      <w:r>
+        <w:rPr>
+          <w:b/>
+          <w:bCs/>
+        </w:rPr>
+        <w:t xml:space="preserve">– </w:t>
+      </w:r>
+      <w:proofErr w:type="gramStart"/>
+      <w:r>
+        <w:rPr>
+          <w:b/>
+          <w:bCs/>
+        </w:rPr>
+        <w:t>O(</w:t>
+      </w:r>
+      <w:proofErr w:type="gramEnd"/>
+      <w:r>
+        <w:rPr>
+          <w:b/>
+          <w:bCs/>
+        </w:rPr>
+        <w:t>1) – Expected as Constant</w:t>
+      </w:r>
+      <w:r>
+        <w:rPr>
+          <w:b/>
+          <w:bCs/>
+        </w:rPr>
+        <w:t xml:space="preserve"> (Amortized)</w:t>
+      </w:r>
+      <w:r>
+        <w:t xml:space="preserve">: </w:t>
+      </w:r>
+      <w:r>
+        <w:t xml:space="preserve">Removing an element from the head does not require shifting, as the head contains the oldest entry. The head moves to the next entry. The wrap logic of the </w:t>
+      </w:r>
+      <w:proofErr w:type="spellStart"/>
+      <w:r>
+        <w:t>RingBufferQueue</w:t>
+      </w:r>
+      <w:proofErr w:type="spellEnd"/>
+      <w:r>
+        <w:t xml:space="preserve"> class allows our method to move one index forward, but if it passes the last index, it is now at the first index.</w:t>
       </w:r>
     </w:p>
     <w:p>
       <w:pPr>
         <w:pStyle w:val="Heading3"/>
+        <w:jc w:val="center"/>
       </w:pPr>
       <w:r>
         <w:t>HashSet</w:t>
       </w:r>
     </w:p>
+    <w:p>
+      <w:r>
+        <w:tab/>
+        <w:t>The HashSet class wraps a Python set. Python’s set is a hash table with open addressing. A Set will essentially reserve space in memory, and open addressing is how the compiler handles items that want to be in the same spot due to the results from the hash function. The benefit for the compiler, in this scenario, is that it’s given a hash that is the first spot for it to check and the open addressing rule helps the compiler quickly find the next spot if that initial one is taken.</w:t>
+      </w:r>
+      <w:r>
+        <w:t xml:space="preserve"> </w:t>
+      </w:r>
+      <w:r>
+        <w:t>Worst-case time is O(n) for all operations during pathological hash collisions, but Python’s hash functions make these outcomes rare.</w:t>
+      </w:r>
+    </w:p>
+    <w:p>
+      <w:r>
+        <w:rPr>
+          <w:b/>
+          <w:bCs/>
+        </w:rPr>
+        <w:t>Add</w:t>
+      </w:r>
+      <w:r>
+        <w:rPr>
+          <w:b/>
+          <w:bCs/>
+        </w:rPr>
+        <w:t>(item)</w:t>
+      </w:r>
+      <w:r>
+        <w:t xml:space="preserve"> </w:t>
+      </w:r>
+      <w:r>
+        <w:rPr>
+          <w:b/>
+          <w:bCs/>
+        </w:rPr>
+        <w:t xml:space="preserve">– </w:t>
+      </w:r>
+      <w:proofErr w:type="gramStart"/>
+      <w:r>
+        <w:rPr>
+          <w:b/>
+          <w:bCs/>
+        </w:rPr>
+        <w:t>O(</w:t>
+      </w:r>
+      <w:proofErr w:type="gramEnd"/>
+      <w:r>
+        <w:rPr>
+          <w:b/>
+          <w:bCs/>
+        </w:rPr>
+        <w:t>1) – Expected as Constant</w:t>
+      </w:r>
+      <w:r>
+        <w:t xml:space="preserve">: </w:t>
+      </w:r>
+      <w:r>
+        <w:t>Insertions are constant-time unless many collisions occur.</w:t>
+      </w:r>
+    </w:p>
+    <w:p>
+      <w:r>
+        <w:rPr>
+          <w:b/>
+          <w:bCs/>
+        </w:rPr>
+        <w:t>Contains</w:t>
+      </w:r>
+      <w:r>
+        <w:rPr>
+          <w:b/>
+          <w:bCs/>
+        </w:rPr>
+        <w:t>(item)</w:t>
+      </w:r>
+      <w:r>
+        <w:t xml:space="preserve"> </w:t>
+      </w:r>
+      <w:r>
+        <w:rPr>
+          <w:b/>
+          <w:bCs/>
+        </w:rPr>
+        <w:t xml:space="preserve">– </w:t>
+      </w:r>
+      <w:proofErr w:type="gramStart"/>
+      <w:r>
+        <w:rPr>
+          <w:b/>
+          <w:bCs/>
+        </w:rPr>
+        <w:t>O(</w:t>
+      </w:r>
+      <w:proofErr w:type="gramEnd"/>
+      <w:r>
+        <w:rPr>
+          <w:b/>
+          <w:bCs/>
+        </w:rPr>
+        <w:t>1) – Expected as Constant</w:t>
+      </w:r>
+      <w:r>
+        <w:t xml:space="preserve">: </w:t>
+      </w:r>
+      <w:r>
+        <w:t>“Searching” for the item is extremely fast due to the hash function computations and quick probing sequences.</w:t>
+      </w:r>
+    </w:p>
+    <w:p/>
     <w:p>
       <w:pPr>
         <w:pStyle w:val="Heading2"/>
       </w:pPr>
       <w:r>
+        <w:lastRenderedPageBreak/>
         <w:t>Data</w:t>
       </w:r>
     </w:p>
+    <w:p>
+      <w:r>
+        <w:rPr>
+          <w:noProof/>
+        </w:rPr>
+        <w:drawing>
+          <wp:inline distT="0" distB="0" distL="0" distR="0" wp14:anchorId="425E90B8" wp14:editId="669A96B3">
+            <wp:extent cx="5943600" cy="2839085"/>
+            <wp:effectExtent l="0" t="0" r="0" b="0"/>
+            <wp:docPr id="674206580" name="Picture 33" descr="A screenshot of a computer program&#10;&#10;AI-generated content may be incorrect."/>
+            <wp:cNvGraphicFramePr>
+              <a:graphicFrameLocks xmlns:a="http://schemas.openxmlformats.org/drawingml/2006/main" noChangeAspect="1"/>
+            </wp:cNvGraphicFramePr>
+            <a:graphic xmlns:a="http://schemas.openxmlformats.org/drawingml/2006/main">
+              <a:graphicData uri="http://schemas.openxmlformats.org/drawingml/2006/picture">
+                <pic:pic xmlns:pic="http://schemas.openxmlformats.org/drawingml/2006/picture">
+                  <pic:nvPicPr>
+                    <pic:cNvPr id="674206580" name="Picture 33" descr="A screenshot of a computer program&#10;&#10;AI-generated content may be incorrect."/>
+                    <pic:cNvPicPr/>
+                  </pic:nvPicPr>
+                  <pic:blipFill>
+                    <a:blip r:embed="rId5">
+                      <a:extLst>
+                        <a:ext uri="{28A0092B-C50C-407E-A947-70E740481C1C}">
+                          <a14:useLocalDpi xmlns:a14="http://schemas.microsoft.com/office/drawing/2010/main" val="0"/>
+                        </a:ext>
+                      </a:extLst>
+                    </a:blip>
+                    <a:stretch>
+                      <a:fillRect/>
+                    </a:stretch>
+                  </pic:blipFill>
+                  <pic:spPr>
+                    <a:xfrm>
+                      <a:off x="0" y="0"/>
+                      <a:ext cx="5943600" cy="2839085"/>
+                    </a:xfrm>
+                    <a:prstGeom prst="rect">
+                      <a:avLst/>
+                    </a:prstGeom>
+                  </pic:spPr>
+                </pic:pic>
+              </a:graphicData>
+            </a:graphic>
+          </wp:inline>
+        </w:drawing>
+      </w:r>
+    </w:p>
+    <w:p>
+      <w:pPr>
+        <w:rPr>
+          <w:b/>
+          <w:bCs/>
+        </w:rPr>
+      </w:pPr>
+      <w:r>
+        <w:rPr>
+          <w:b/>
+          <w:bCs/>
+        </w:rPr>
+        <w:t>Methods and Complexities</w:t>
+      </w:r>
+    </w:p>
+    <w:tbl>
+      <w:tblPr>
+        <w:tblStyle w:val="TableGrid"/>
+        <w:tblW w:w="0" w:type="auto"/>
+        <w:tblLook w:val="04A0" w:firstRow="1" w:lastRow="0" w:firstColumn="1" w:lastColumn="0" w:noHBand="0" w:noVBand="1"/>
+      </w:tblPr>
+      <w:tblGrid>
+        <w:gridCol w:w="3116"/>
+        <w:gridCol w:w="3117"/>
+        <w:gridCol w:w="3117"/>
+      </w:tblGrid>
+      <w:tr>
+        <w:trPr>
+          <w:trHeight w:val="503"/>
+        </w:trPr>
+        <w:tc>
+          <w:tcPr>
+            <w:tcW w:w="9350" w:type="dxa"/>
+            <w:gridSpan w:val="3"/>
+          </w:tcPr>
+          <w:p>
+            <w:pPr>
+              <w:jc w:val="center"/>
+            </w:pPr>
+            <w:proofErr w:type="spellStart"/>
+            <w:r>
+              <w:rPr>
+                <w:b/>
+                <w:bCs/>
+                <w:color w:val="0070C0"/>
+              </w:rPr>
+              <w:t>DyanmicArray</w:t>
+            </w:r>
+            <w:proofErr w:type="spellEnd"/>
+          </w:p>
+        </w:tc>
+      </w:tr>
+      <w:tr>
+        <w:trPr>
+          <w:trHeight w:val="377"/>
+        </w:trPr>
+        <w:tc>
+          <w:tcPr>
+            <w:tcW w:w="3116" w:type="dxa"/>
+          </w:tcPr>
+          <w:p>
+            <w:pPr>
+              <w:rPr>
+                <w:b/>
+                <w:bCs/>
+              </w:rPr>
+            </w:pPr>
+            <w:r>
+              <w:rPr>
+                <w:b/>
+                <w:bCs/>
+              </w:rPr>
+              <w:t>Operation</w:t>
+            </w:r>
+          </w:p>
+        </w:tc>
+        <w:tc>
+          <w:tcPr>
+            <w:tcW w:w="3117" w:type="dxa"/>
+          </w:tcPr>
+          <w:p>
+            <w:pPr>
+              <w:rPr>
+                <w:b/>
+                <w:bCs/>
+              </w:rPr>
+            </w:pPr>
+            <w:r>
+              <w:rPr>
+                <w:b/>
+                <w:bCs/>
+              </w:rPr>
+              <w:t>append(item)</w:t>
+            </w:r>
+          </w:p>
+        </w:tc>
+        <w:tc>
+          <w:tcPr>
+            <w:tcW w:w="3117" w:type="dxa"/>
+          </w:tcPr>
+          <w:p>
+            <w:pPr>
+              <w:rPr>
+                <w:b/>
+                <w:bCs/>
+              </w:rPr>
+            </w:pPr>
+            <w:proofErr w:type="gramStart"/>
+            <w:r>
+              <w:rPr>
+                <w:b/>
+                <w:bCs/>
+              </w:rPr>
+              <w:t>pop(</w:t>
+            </w:r>
+            <w:proofErr w:type="gramEnd"/>
+            <w:r>
+              <w:rPr>
+                <w:b/>
+                <w:bCs/>
+              </w:rPr>
+              <w:t>)</w:t>
+            </w:r>
+          </w:p>
+        </w:tc>
+      </w:tr>
+      <w:tr>
+        <w:trPr>
+          <w:trHeight w:val="800"/>
+        </w:trPr>
+        <w:tc>
+          <w:tcPr>
+            <w:tcW w:w="3116" w:type="dxa"/>
+            <w:vAlign w:val="center"/>
+          </w:tcPr>
+          <w:p>
+            <w:r>
+              <w:t xml:space="preserve">n=1000 to n=10000 </w:t>
+            </w:r>
+          </w:p>
+        </w:tc>
+        <w:tc>
+          <w:tcPr>
+            <w:tcW w:w="3117" w:type="dxa"/>
+          </w:tcPr>
+          <w:p>
+            <w:pPr>
+              <w:rPr>
+                <w:rFonts w:eastAsiaTheme="minorEastAsia"/>
+              </w:rPr>
+            </w:pPr>
+            <m:oMath>
+              <m:f>
+                <m:fPr>
+                  <m:ctrlPr>
+                    <w:rPr>
+                      <w:rFonts w:ascii="Cambria Math" w:hAnsi="Cambria Math"/>
+                    </w:rPr>
+                  </m:ctrlPr>
+                </m:fPr>
+                <m:num>
+                  <m:r>
+                    <w:rPr>
+                      <w:rFonts w:ascii="Cambria Math" w:hAnsi="Cambria Math"/>
+                    </w:rPr>
+                    <m:t>0.000517</m:t>
+                  </m:r>
+                </m:num>
+                <m:den>
+                  <m:r>
+                    <w:rPr>
+                      <w:rFonts w:ascii="Cambria Math" w:hAnsi="Cambria Math"/>
+                    </w:rPr>
+                    <m:t>0.000093</m:t>
+                  </m:r>
+                </m:den>
+              </m:f>
+              <m:r>
+                <w:rPr>
+                  <w:rFonts w:ascii="Cambria Math" w:hAnsi="Cambria Math"/>
+                </w:rPr>
+                <m:t>≈5.5</m:t>
+              </m:r>
+              <m:r>
+                <w:rPr>
+                  <w:rFonts w:ascii="Cambria Math" w:hAnsi="Cambria Math"/>
+                </w:rPr>
+                <m:t>6</m:t>
+              </m:r>
+            </m:oMath>
+            <w:r>
+              <w:rPr>
+                <w:rFonts w:eastAsiaTheme="minorEastAsia"/>
+              </w:rPr>
+              <w:t xml:space="preserve"> </w:t>
+            </w:r>
+          </w:p>
+        </w:tc>
+        <w:tc>
+          <w:tcPr>
+            <w:tcW w:w="3117" w:type="dxa"/>
+          </w:tcPr>
+          <w:p>
+            <m:oMath>
+              <m:f>
+                <m:fPr>
+                  <m:ctrlPr>
+                    <w:rPr>
+                      <w:rFonts w:ascii="Cambria Math" w:hAnsi="Cambria Math"/>
+                    </w:rPr>
+                  </m:ctrlPr>
+                </m:fPr>
+                <m:num>
+                  <m:r>
+                    <w:rPr>
+                      <w:rFonts w:ascii="Cambria Math" w:hAnsi="Cambria Math"/>
+                    </w:rPr>
+                    <m:t>0.000869</m:t>
+                  </m:r>
+                </m:num>
+                <m:den>
+                  <m:r>
+                    <w:rPr>
+                      <w:rFonts w:ascii="Cambria Math" w:hAnsi="Cambria Math"/>
+                    </w:rPr>
+                    <m:t>0.000116</m:t>
+                  </m:r>
+                </m:den>
+              </m:f>
+              <m:r>
+                <w:rPr>
+                  <w:rFonts w:ascii="Cambria Math" w:hAnsi="Cambria Math"/>
+                </w:rPr>
+                <m:t>≈7.5</m:t>
+              </m:r>
+            </m:oMath>
+            <w:r>
+              <w:t xml:space="preserve"> </w:t>
+            </w:r>
+          </w:p>
+        </w:tc>
+      </w:tr>
+      <w:tr>
+        <w:trPr>
+          <w:trHeight w:val="881"/>
+        </w:trPr>
+        <w:tc>
+          <w:tcPr>
+            <w:tcW w:w="3116" w:type="dxa"/>
+            <w:vAlign w:val="center"/>
+          </w:tcPr>
+          <w:p>
+            <w:r>
+              <w:t xml:space="preserve">n=10000 to n=100000 </w:t>
+            </w:r>
+          </w:p>
+        </w:tc>
+        <w:tc>
+          <w:tcPr>
+            <w:tcW w:w="3117" w:type="dxa"/>
+          </w:tcPr>
+          <w:p>
+            <m:oMath>
+              <m:f>
+                <m:fPr>
+                  <m:ctrlPr>
+                    <w:rPr>
+                      <w:rFonts w:ascii="Cambria Math" w:hAnsi="Cambria Math"/>
+                    </w:rPr>
+                  </m:ctrlPr>
+                </m:fPr>
+                <m:num>
+                  <m:r>
+                    <w:rPr>
+                      <w:rFonts w:ascii="Cambria Math" w:hAnsi="Cambria Math"/>
+                    </w:rPr>
+                    <m:t>0.005718</m:t>
+                  </m:r>
+                </m:num>
+                <m:den>
+                  <m:r>
+                    <w:rPr>
+                      <w:rFonts w:ascii="Cambria Math" w:hAnsi="Cambria Math"/>
+                    </w:rPr>
+                    <m:t>0.000517</m:t>
+                  </m:r>
+                </m:den>
+              </m:f>
+              <m:r>
+                <w:rPr>
+                  <w:rFonts w:ascii="Cambria Math" w:hAnsi="Cambria Math"/>
+                </w:rPr>
+                <m:t>≈11.06</m:t>
+              </m:r>
+            </m:oMath>
+            <w:r>
+              <w:t xml:space="preserve"> </w:t>
+            </w:r>
+          </w:p>
+        </w:tc>
+        <w:tc>
+          <w:tcPr>
+            <w:tcW w:w="3117" w:type="dxa"/>
+          </w:tcPr>
+          <w:p>
+            <m:oMath>
+              <m:f>
+                <m:fPr>
+                  <m:ctrlPr>
+                    <w:rPr>
+                      <w:rFonts w:ascii="Cambria Math" w:hAnsi="Cambria Math"/>
+                    </w:rPr>
+                  </m:ctrlPr>
+                </m:fPr>
+                <m:num>
+                  <m:r>
+                    <w:rPr>
+                      <w:rFonts w:ascii="Cambria Math" w:hAnsi="Cambria Math"/>
+                    </w:rPr>
+                    <m:t>0.009723</m:t>
+                  </m:r>
+                </m:num>
+                <m:den>
+                  <m:r>
+                    <w:rPr>
+                      <w:rFonts w:ascii="Cambria Math" w:hAnsi="Cambria Math"/>
+                    </w:rPr>
+                    <m:t>0.000869</m:t>
+                  </m:r>
+                </m:den>
+              </m:f>
+              <m:r>
+                <w:rPr>
+                  <w:rFonts w:ascii="Cambria Math" w:hAnsi="Cambria Math"/>
+                </w:rPr>
+                <m:t>≈11.19</m:t>
+              </m:r>
+            </m:oMath>
+            <w:r>
+              <w:t xml:space="preserve"> </w:t>
+            </w:r>
+          </w:p>
+        </w:tc>
+      </w:tr>
+      <w:tr>
+        <w:trPr>
+          <w:trHeight w:val="503"/>
+        </w:trPr>
+        <w:tc>
+          <w:tcPr>
+            <w:tcW w:w="9350" w:type="dxa"/>
+            <w:gridSpan w:val="3"/>
+          </w:tcPr>
+          <w:p>
+            <w:pPr>
+              <w:jc w:val="center"/>
+            </w:pPr>
+            <w:r>
+              <w:rPr>
+                <w:b/>
+                <w:bCs/>
+                <w:color w:val="0070C0"/>
+              </w:rPr>
+              <w:t>Stack</w:t>
+            </w:r>
+          </w:p>
+        </w:tc>
+      </w:tr>
+      <w:tr>
+        <w:trPr>
+          <w:trHeight w:val="386"/>
+        </w:trPr>
+        <w:tc>
+          <w:tcPr>
+            <w:tcW w:w="3116" w:type="dxa"/>
+          </w:tcPr>
+          <w:p>
+            <w:pPr>
+              <w:rPr>
+                <w:b/>
+                <w:bCs/>
+              </w:rPr>
+            </w:pPr>
+            <w:r>
+              <w:rPr>
+                <w:b/>
+                <w:bCs/>
+              </w:rPr>
+              <w:t>Operation</w:t>
+            </w:r>
+          </w:p>
+        </w:tc>
+        <w:tc>
+          <w:tcPr>
+            <w:tcW w:w="3117" w:type="dxa"/>
+          </w:tcPr>
+          <w:p>
+            <w:pPr>
+              <w:rPr>
+                <w:b/>
+                <w:bCs/>
+              </w:rPr>
+            </w:pPr>
+            <w:r>
+              <w:rPr>
+                <w:b/>
+                <w:bCs/>
+              </w:rPr>
+              <w:t>push(item)</w:t>
+            </w:r>
+          </w:p>
+        </w:tc>
+        <w:tc>
+          <w:tcPr>
+            <w:tcW w:w="3117" w:type="dxa"/>
+          </w:tcPr>
+          <w:p>
+            <w:pPr>
+              <w:rPr>
+                <w:b/>
+                <w:bCs/>
+              </w:rPr>
+            </w:pPr>
+            <w:proofErr w:type="gramStart"/>
+            <w:r>
+              <w:rPr>
+                <w:b/>
+                <w:bCs/>
+              </w:rPr>
+              <w:t>pop(</w:t>
+            </w:r>
+            <w:proofErr w:type="gramEnd"/>
+            <w:r>
+              <w:rPr>
+                <w:b/>
+                <w:bCs/>
+              </w:rPr>
+              <w:t>)</w:t>
+            </w:r>
+          </w:p>
+        </w:tc>
+      </w:tr>
+      <w:tr>
+        <w:trPr>
+          <w:trHeight w:val="800"/>
+        </w:trPr>
+        <w:tc>
+          <w:tcPr>
+            <w:tcW w:w="3116" w:type="dxa"/>
+            <w:vAlign w:val="center"/>
+          </w:tcPr>
+          <w:p>
+            <w:r>
+              <w:t xml:space="preserve">n=1000 to n=10000 </w:t>
+            </w:r>
+          </w:p>
+        </w:tc>
+        <w:tc>
+          <w:tcPr>
+            <w:tcW w:w="3117" w:type="dxa"/>
+          </w:tcPr>
+          <w:p>
+            <w:pPr>
+              <w:rPr>
+                <w:rFonts w:eastAsiaTheme="minorEastAsia"/>
+              </w:rPr>
+            </w:pPr>
+            <m:oMath>
+              <m:f>
+                <m:fPr>
+                  <m:ctrlPr>
+                    <w:rPr>
+                      <w:rFonts w:ascii="Cambria Math" w:hAnsi="Cambria Math"/>
+                    </w:rPr>
+                  </m:ctrlPr>
+                </m:fPr>
+                <m:num>
+                  <m:r>
+                    <w:rPr>
+                      <w:rFonts w:ascii="Cambria Math" w:hAnsi="Cambria Math"/>
+                    </w:rPr>
+                    <m:t>0.000454</m:t>
+                  </m:r>
+                </m:num>
+                <m:den>
+                  <m:r>
+                    <w:rPr>
+                      <w:rFonts w:ascii="Cambria Math" w:hAnsi="Cambria Math"/>
+                    </w:rPr>
+                    <m:t>0.000077</m:t>
+                  </m:r>
+                </m:den>
+              </m:f>
+              <m:r>
+                <w:rPr>
+                  <w:rFonts w:ascii="Cambria Math" w:hAnsi="Cambria Math"/>
+                </w:rPr>
+                <m:t>≈5.89</m:t>
+              </m:r>
+            </m:oMath>
+            <w:r>
+              <w:rPr>
+                <w:rFonts w:eastAsiaTheme="minorEastAsia"/>
+              </w:rPr>
+              <w:t xml:space="preserve"> </w:t>
+            </w:r>
+          </w:p>
+        </w:tc>
+        <w:tc>
+          <w:tcPr>
+            <w:tcW w:w="3117" w:type="dxa"/>
+          </w:tcPr>
+          <w:p>
+            <m:oMath>
+              <m:f>
+                <m:fPr>
+                  <m:ctrlPr>
+                    <w:rPr>
+                      <w:rFonts w:ascii="Cambria Math" w:hAnsi="Cambria Math"/>
+                    </w:rPr>
+                  </m:ctrlPr>
+                </m:fPr>
+                <m:num>
+                  <m:r>
+                    <w:rPr>
+                      <w:rFonts w:ascii="Cambria Math" w:hAnsi="Cambria Math"/>
+                    </w:rPr>
+                    <m:t>0.000918</m:t>
+                  </m:r>
+                </m:num>
+                <m:den>
+                  <m:r>
+                    <w:rPr>
+                      <w:rFonts w:ascii="Cambria Math" w:hAnsi="Cambria Math"/>
+                    </w:rPr>
+                    <m:t>0.000141</m:t>
+                  </m:r>
+                </m:den>
+              </m:f>
+              <m:r>
+                <w:rPr>
+                  <w:rFonts w:ascii="Cambria Math" w:hAnsi="Cambria Math"/>
+                </w:rPr>
+                <m:t>≈6.51</m:t>
+              </m:r>
+            </m:oMath>
+            <w:r>
+              <w:t xml:space="preserve"> </w:t>
+            </w:r>
+          </w:p>
+        </w:tc>
+      </w:tr>
+      <w:tr>
+        <w:trPr>
+          <w:trHeight w:val="881"/>
+        </w:trPr>
+        <w:tc>
+          <w:tcPr>
+            <w:tcW w:w="3116" w:type="dxa"/>
+            <w:vAlign w:val="center"/>
+          </w:tcPr>
+          <w:p>
+            <w:r>
+              <w:t xml:space="preserve">n=10000 to n=100000 </w:t>
+            </w:r>
+          </w:p>
+        </w:tc>
+        <w:tc>
+          <w:tcPr>
+            <w:tcW w:w="3117" w:type="dxa"/>
+          </w:tcPr>
+          <w:p>
+            <m:oMath>
+              <m:f>
+                <m:fPr>
+                  <m:ctrlPr>
+                    <w:rPr>
+                      <w:rFonts w:ascii="Cambria Math" w:hAnsi="Cambria Math"/>
+                    </w:rPr>
+                  </m:ctrlPr>
+                </m:fPr>
+                <m:num>
+                  <m:r>
+                    <w:rPr>
+                      <w:rFonts w:ascii="Cambria Math" w:hAnsi="Cambria Math"/>
+                    </w:rPr>
+                    <m:t>0.005923</m:t>
+                  </m:r>
+                </m:num>
+                <m:den>
+                  <m:r>
+                    <w:rPr>
+                      <w:rFonts w:ascii="Cambria Math" w:hAnsi="Cambria Math"/>
+                    </w:rPr>
+                    <m:t>0.000454</m:t>
+                  </m:r>
+                </m:den>
+              </m:f>
+              <m:r>
+                <w:rPr>
+                  <w:rFonts w:ascii="Cambria Math" w:hAnsi="Cambria Math"/>
+                </w:rPr>
+                <m:t>≈13.05</m:t>
+              </m:r>
+            </m:oMath>
+            <w:r>
+              <w:t xml:space="preserve"> </w:t>
+            </w:r>
+          </w:p>
+        </w:tc>
+        <w:tc>
+          <w:tcPr>
+            <w:tcW w:w="3117" w:type="dxa"/>
+          </w:tcPr>
+          <w:p>
+            <m:oMath>
+              <m:f>
+                <m:fPr>
+                  <m:ctrlPr>
+                    <w:rPr>
+                      <w:rFonts w:ascii="Cambria Math" w:hAnsi="Cambria Math"/>
+                    </w:rPr>
+                  </m:ctrlPr>
+                </m:fPr>
+                <m:num>
+                  <m:r>
+                    <w:rPr>
+                      <w:rFonts w:ascii="Cambria Math" w:hAnsi="Cambria Math"/>
+                    </w:rPr>
+                    <m:t>0.010126</m:t>
+                  </m:r>
+                </m:num>
+                <m:den>
+                  <m:r>
+                    <w:rPr>
+                      <w:rFonts w:ascii="Cambria Math" w:hAnsi="Cambria Math"/>
+                    </w:rPr>
+                    <m:t>0.000918</m:t>
+                  </m:r>
+                </m:den>
+              </m:f>
+              <m:r>
+                <w:rPr>
+                  <w:rFonts w:ascii="Cambria Math" w:hAnsi="Cambria Math"/>
+                </w:rPr>
+                <m:t>≈11.03</m:t>
+              </m:r>
+            </m:oMath>
+            <w:r>
+              <w:t xml:space="preserve"> </w:t>
+            </w:r>
+          </w:p>
+        </w:tc>
+      </w:tr>
+      <w:tr>
+        <w:trPr>
+          <w:trHeight w:val="503"/>
+        </w:trPr>
+        <w:tc>
+          <w:tcPr>
+            <w:tcW w:w="9350" w:type="dxa"/>
+            <w:gridSpan w:val="3"/>
+          </w:tcPr>
+          <w:p>
+            <w:pPr>
+              <w:jc w:val="center"/>
+            </w:pPr>
+            <w:proofErr w:type="spellStart"/>
+            <w:r>
+              <w:rPr>
+                <w:b/>
+                <w:bCs/>
+                <w:color w:val="0070C0"/>
+              </w:rPr>
+              <w:t>RingBufferQueue</w:t>
+            </w:r>
+            <w:proofErr w:type="spellEnd"/>
+          </w:p>
+        </w:tc>
+      </w:tr>
+      <w:tr>
+        <w:trPr>
+          <w:trHeight w:val="377"/>
+        </w:trPr>
+        <w:tc>
+          <w:tcPr>
+            <w:tcW w:w="3116" w:type="dxa"/>
+          </w:tcPr>
+          <w:p>
+            <w:pPr>
+              <w:rPr>
+                <w:b/>
+                <w:bCs/>
+              </w:rPr>
+            </w:pPr>
+            <w:r>
+              <w:rPr>
+                <w:b/>
+                <w:bCs/>
+              </w:rPr>
+              <w:t>Operation</w:t>
+            </w:r>
+          </w:p>
+        </w:tc>
+        <w:tc>
+          <w:tcPr>
+            <w:tcW w:w="3117" w:type="dxa"/>
+          </w:tcPr>
+          <w:p>
+            <w:pPr>
+              <w:rPr>
+                <w:b/>
+                <w:bCs/>
+              </w:rPr>
+            </w:pPr>
+            <w:r>
+              <w:rPr>
+                <w:b/>
+                <w:bCs/>
+              </w:rPr>
+              <w:t>e</w:t>
+            </w:r>
+            <w:r>
+              <w:rPr>
+                <w:b/>
+                <w:bCs/>
+              </w:rPr>
+              <w:t>nqueue</w:t>
+            </w:r>
+            <w:r>
+              <w:rPr>
+                <w:b/>
+                <w:bCs/>
+              </w:rPr>
+              <w:t>(item)</w:t>
+            </w:r>
+          </w:p>
+        </w:tc>
+        <w:tc>
+          <w:tcPr>
+            <w:tcW w:w="3117" w:type="dxa"/>
+          </w:tcPr>
+          <w:p>
+            <w:pPr>
+              <w:rPr>
+                <w:b/>
+                <w:bCs/>
+              </w:rPr>
+            </w:pPr>
+            <w:r>
+              <w:rPr>
+                <w:b/>
+                <w:bCs/>
+              </w:rPr>
+              <w:t>dequeue</w:t>
+            </w:r>
+          </w:p>
+        </w:tc>
+      </w:tr>
+      <w:tr>
+        <w:trPr>
+          <w:trHeight w:val="800"/>
+        </w:trPr>
+        <w:tc>
+          <w:tcPr>
+            <w:tcW w:w="3116" w:type="dxa"/>
+            <w:vAlign w:val="center"/>
+          </w:tcPr>
+          <w:p>
+            <w:r>
+              <w:t xml:space="preserve">n=1000 to n=10000 </w:t>
+            </w:r>
+          </w:p>
+        </w:tc>
+        <w:tc>
+          <w:tcPr>
+            <w:tcW w:w="3117" w:type="dxa"/>
+          </w:tcPr>
+          <w:p>
+            <w:pPr>
+              <w:rPr>
+                <w:rFonts w:eastAsiaTheme="minorEastAsia"/>
+              </w:rPr>
+            </w:pPr>
+            <m:oMath>
+              <m:f>
+                <m:fPr>
+                  <m:ctrlPr>
+                    <w:rPr>
+                      <w:rFonts w:ascii="Cambria Math" w:hAnsi="Cambria Math"/>
+                    </w:rPr>
+                  </m:ctrlPr>
+                </m:fPr>
+                <m:num>
+                  <m:r>
+                    <w:rPr>
+                      <w:rFonts w:ascii="Cambria Math" w:hAnsi="Cambria Math"/>
+                    </w:rPr>
+                    <m:t>0.002182</m:t>
+                  </m:r>
+                </m:num>
+                <m:den>
+                  <m:r>
+                    <w:rPr>
+                      <w:rFonts w:ascii="Cambria Math" w:hAnsi="Cambria Math"/>
+                    </w:rPr>
+                    <m:t>0.000205</m:t>
+                  </m:r>
+                </m:den>
+              </m:f>
+              <m:r>
+                <w:rPr>
+                  <w:rFonts w:ascii="Cambria Math" w:hAnsi="Cambria Math"/>
+                </w:rPr>
+                <m:t>≈10.64</m:t>
+              </m:r>
+            </m:oMath>
+            <w:r>
+              <w:rPr>
+                <w:rFonts w:eastAsiaTheme="minorEastAsia"/>
+              </w:rPr>
+              <w:t xml:space="preserve"> </w:t>
+            </w:r>
+          </w:p>
+        </w:tc>
+        <w:tc>
+          <w:tcPr>
+            <w:tcW w:w="3117" w:type="dxa"/>
+          </w:tcPr>
+          <w:p>
+            <m:oMath>
+              <m:f>
+                <m:fPr>
+                  <m:ctrlPr>
+                    <w:rPr>
+                      <w:rFonts w:ascii="Cambria Math" w:hAnsi="Cambria Math"/>
+                    </w:rPr>
+                  </m:ctrlPr>
+                </m:fPr>
+                <m:num>
+                  <m:r>
+                    <w:rPr>
+                      <w:rFonts w:ascii="Cambria Math" w:hAnsi="Cambria Math"/>
+                    </w:rPr>
+                    <m:t>0.003348</m:t>
+                  </m:r>
+                </m:num>
+                <m:den>
+                  <m:r>
+                    <w:rPr>
+                      <w:rFonts w:ascii="Cambria Math" w:hAnsi="Cambria Math"/>
+                    </w:rPr>
+                    <m:t>0.000300</m:t>
+                  </m:r>
+                </m:den>
+              </m:f>
+              <m:r>
+                <w:rPr>
+                  <w:rFonts w:ascii="Cambria Math" w:hAnsi="Cambria Math"/>
+                </w:rPr>
+                <m:t>≈11.16</m:t>
+              </m:r>
+            </m:oMath>
+            <w:r>
+              <w:t xml:space="preserve"> </w:t>
+            </w:r>
+          </w:p>
+        </w:tc>
+      </w:tr>
+      <w:tr>
+        <w:trPr>
+          <w:trHeight w:val="881"/>
+        </w:trPr>
+        <w:tc>
+          <w:tcPr>
+            <w:tcW w:w="3116" w:type="dxa"/>
+            <w:vAlign w:val="center"/>
+          </w:tcPr>
+          <w:p>
+            <w:r>
+              <w:lastRenderedPageBreak/>
+              <w:t xml:space="preserve">n=10000 to n=100000 </w:t>
+            </w:r>
+          </w:p>
+        </w:tc>
+        <w:tc>
+          <w:tcPr>
+            <w:tcW w:w="3117" w:type="dxa"/>
+          </w:tcPr>
+          <w:p>
+            <m:oMath>
+              <m:f>
+                <m:fPr>
+                  <m:ctrlPr>
+                    <w:rPr>
+                      <w:rFonts w:ascii="Cambria Math" w:hAnsi="Cambria Math"/>
+                    </w:rPr>
+                  </m:ctrlPr>
+                </m:fPr>
+                <m:num>
+                  <m:r>
+                    <w:rPr>
+                      <w:rFonts w:ascii="Cambria Math" w:hAnsi="Cambria Math"/>
+                    </w:rPr>
+                    <m:t>0.019782</m:t>
+                  </m:r>
+                </m:num>
+                <m:den>
+                  <m:r>
+                    <w:rPr>
+                      <w:rFonts w:ascii="Cambria Math" w:hAnsi="Cambria Math"/>
+                    </w:rPr>
+                    <m:t>0.002182</m:t>
+                  </m:r>
+                </m:den>
+              </m:f>
+              <m:r>
+                <w:rPr>
+                  <w:rFonts w:ascii="Cambria Math" w:hAnsi="Cambria Math"/>
+                </w:rPr>
+                <m:t>≈9.07</m:t>
+              </m:r>
+            </m:oMath>
+            <w:r>
+              <w:t xml:space="preserve"> </w:t>
+            </w:r>
+          </w:p>
+        </w:tc>
+        <w:tc>
+          <w:tcPr>
+            <w:tcW w:w="3117" w:type="dxa"/>
+          </w:tcPr>
+          <w:p>
+            <m:oMath>
+              <m:f>
+                <m:fPr>
+                  <m:ctrlPr>
+                    <w:rPr>
+                      <w:rFonts w:ascii="Cambria Math" w:hAnsi="Cambria Math"/>
+                    </w:rPr>
+                  </m:ctrlPr>
+                </m:fPr>
+                <m:num>
+                  <m:r>
+                    <w:rPr>
+                      <w:rFonts w:ascii="Cambria Math" w:hAnsi="Cambria Math"/>
+                    </w:rPr>
+                    <m:t>0.032659</m:t>
+                  </m:r>
+                </m:num>
+                <m:den>
+                  <m:r>
+                    <w:rPr>
+                      <w:rFonts w:ascii="Cambria Math" w:hAnsi="Cambria Math"/>
+                    </w:rPr>
+                    <m:t>0.003348</m:t>
+                  </m:r>
+                </m:den>
+              </m:f>
+              <m:r>
+                <w:rPr>
+                  <w:rFonts w:ascii="Cambria Math" w:hAnsi="Cambria Math"/>
+                </w:rPr>
+                <m:t>≈9.75</m:t>
+              </m:r>
+            </m:oMath>
+            <w:r>
+              <w:t xml:space="preserve"> </w:t>
+            </w:r>
+          </w:p>
+        </w:tc>
+      </w:tr>
+      <w:tr>
+        <w:trPr>
+          <w:trHeight w:val="503"/>
+        </w:trPr>
+        <w:tc>
+          <w:tcPr>
+            <w:tcW w:w="9350" w:type="dxa"/>
+            <w:gridSpan w:val="3"/>
+          </w:tcPr>
+          <w:p>
+            <w:pPr>
+              <w:jc w:val="center"/>
+            </w:pPr>
+            <w:r>
+              <w:rPr>
+                <w:b/>
+                <w:bCs/>
+                <w:color w:val="0070C0"/>
+              </w:rPr>
+              <w:t>HashSet</w:t>
+            </w:r>
+          </w:p>
+        </w:tc>
+      </w:tr>
+      <w:tr>
+        <w:trPr>
+          <w:trHeight w:val="386"/>
+        </w:trPr>
+        <w:tc>
+          <w:tcPr>
+            <w:tcW w:w="3116" w:type="dxa"/>
+          </w:tcPr>
+          <w:p>
+            <w:pPr>
+              <w:rPr>
+                <w:b/>
+                <w:bCs/>
+              </w:rPr>
+            </w:pPr>
+            <w:r>
+              <w:rPr>
+                <w:b/>
+                <w:bCs/>
+              </w:rPr>
+              <w:t>Operation</w:t>
+            </w:r>
+          </w:p>
+        </w:tc>
+        <w:tc>
+          <w:tcPr>
+            <w:tcW w:w="3117" w:type="dxa"/>
+          </w:tcPr>
+          <w:p>
+            <w:pPr>
+              <w:rPr>
+                <w:b/>
+                <w:bCs/>
+              </w:rPr>
+            </w:pPr>
+            <w:r>
+              <w:rPr>
+                <w:b/>
+                <w:bCs/>
+              </w:rPr>
+              <w:t>add(item)</w:t>
+            </w:r>
+          </w:p>
+        </w:tc>
+        <w:tc>
+          <w:tcPr>
+            <w:tcW w:w="3117" w:type="dxa"/>
+          </w:tcPr>
+          <w:p>
+            <w:pPr>
+              <w:rPr>
+                <w:b/>
+                <w:bCs/>
+              </w:rPr>
+            </w:pPr>
+            <w:r>
+              <w:rPr>
+                <w:b/>
+                <w:bCs/>
+              </w:rPr>
+              <w:t>contains(item)</w:t>
+            </w:r>
+          </w:p>
+        </w:tc>
+      </w:tr>
+      <w:tr>
+        <w:trPr>
+          <w:trHeight w:val="800"/>
+        </w:trPr>
+        <w:tc>
+          <w:tcPr>
+            <w:tcW w:w="3116" w:type="dxa"/>
+            <w:vAlign w:val="center"/>
+          </w:tcPr>
+          <w:p>
+            <w:r>
+              <w:t xml:space="preserve">n=1000 to n=10000 </w:t>
+            </w:r>
+          </w:p>
+        </w:tc>
+        <w:tc>
+          <w:tcPr>
+            <w:tcW w:w="3117" w:type="dxa"/>
+          </w:tcPr>
+          <w:p>
+            <w:pPr>
+              <w:rPr>
+                <w:rFonts w:eastAsiaTheme="minorEastAsia"/>
+              </w:rPr>
+            </w:pPr>
+            <m:oMath>
+              <m:f>
+                <m:fPr>
+                  <m:ctrlPr>
+                    <w:rPr>
+                      <w:rFonts w:ascii="Cambria Math" w:hAnsi="Cambria Math"/>
+                    </w:rPr>
+                  </m:ctrlPr>
+                </m:fPr>
+                <m:num>
+                  <m:r>
+                    <w:rPr>
+                      <w:rFonts w:ascii="Cambria Math" w:hAnsi="Cambria Math"/>
+                    </w:rPr>
+                    <m:t>0.000650</m:t>
+                  </m:r>
+                </m:num>
+                <m:den>
+                  <m:r>
+                    <w:rPr>
+                      <w:rFonts w:ascii="Cambria Math" w:hAnsi="Cambria Math"/>
+                    </w:rPr>
+                    <m:t>0.000082</m:t>
+                  </m:r>
+                </m:den>
+              </m:f>
+              <m:r>
+                <w:rPr>
+                  <w:rFonts w:ascii="Cambria Math" w:hAnsi="Cambria Math"/>
+                </w:rPr>
+                <m:t>≈7.93</m:t>
+              </m:r>
+            </m:oMath>
+            <w:r>
+              <w:rPr>
+                <w:rFonts w:eastAsiaTheme="minorEastAsia"/>
+              </w:rPr>
+              <w:t xml:space="preserve"> </w:t>
+            </w:r>
+          </w:p>
+        </w:tc>
+        <w:tc>
+          <w:tcPr>
+            <w:tcW w:w="3117" w:type="dxa"/>
+          </w:tcPr>
+          <w:p>
+            <m:oMath>
+              <m:f>
+                <m:fPr>
+                  <m:ctrlPr>
+                    <w:rPr>
+                      <w:rFonts w:ascii="Cambria Math" w:hAnsi="Cambria Math"/>
+                    </w:rPr>
+                  </m:ctrlPr>
+                </m:fPr>
+                <m:num>
+                  <m:r>
+                    <w:rPr>
+                      <w:rFonts w:ascii="Cambria Math" w:hAnsi="Cambria Math"/>
+                    </w:rPr>
+                    <m:t>0.001176</m:t>
+                  </m:r>
+                </m:num>
+                <m:den>
+                  <m:r>
+                    <w:rPr>
+                      <w:rFonts w:ascii="Cambria Math" w:hAnsi="Cambria Math"/>
+                    </w:rPr>
+                    <m:t>0.000097</m:t>
+                  </m:r>
+                </m:den>
+              </m:f>
+              <m:r>
+                <w:rPr>
+                  <w:rFonts w:ascii="Cambria Math" w:hAnsi="Cambria Math"/>
+                </w:rPr>
+                <m:t>≈12.12</m:t>
+              </m:r>
+            </m:oMath>
+            <w:r>
+              <w:t xml:space="preserve"> </w:t>
+            </w:r>
+          </w:p>
+        </w:tc>
+      </w:tr>
+      <w:tr>
+        <w:trPr>
+          <w:trHeight w:val="881"/>
+        </w:trPr>
+        <w:tc>
+          <w:tcPr>
+            <w:tcW w:w="3116" w:type="dxa"/>
+            <w:vAlign w:val="center"/>
+          </w:tcPr>
+          <w:p>
+            <w:r>
+              <w:t xml:space="preserve">n=10000 to n=100000 </w:t>
+            </w:r>
+          </w:p>
+        </w:tc>
+        <w:tc>
+          <w:tcPr>
+            <w:tcW w:w="3117" w:type="dxa"/>
+          </w:tcPr>
+          <w:p>
+            <m:oMath>
+              <m:f>
+                <m:fPr>
+                  <m:ctrlPr>
+                    <w:rPr>
+                      <w:rFonts w:ascii="Cambria Math" w:hAnsi="Cambria Math"/>
+                    </w:rPr>
+                  </m:ctrlPr>
+                </m:fPr>
+                <m:num>
+                  <m:r>
+                    <w:rPr>
+                      <w:rFonts w:ascii="Cambria Math" w:hAnsi="Cambria Math"/>
+                    </w:rPr>
+                    <m:t>0.007720</m:t>
+                  </m:r>
+                </m:num>
+                <m:den>
+                  <m:r>
+                    <w:rPr>
+                      <w:rFonts w:ascii="Cambria Math" w:hAnsi="Cambria Math"/>
+                    </w:rPr>
+                    <m:t>0.000650</m:t>
+                  </m:r>
+                </m:den>
+              </m:f>
+              <m:r>
+                <w:rPr>
+                  <w:rFonts w:ascii="Cambria Math" w:hAnsi="Cambria Math"/>
+                </w:rPr>
+                <m:t>≈11.88</m:t>
+              </m:r>
+            </m:oMath>
+            <w:r>
+              <w:t xml:space="preserve"> </w:t>
+            </w:r>
+          </w:p>
+        </w:tc>
+        <w:tc>
+          <w:tcPr>
+            <w:tcW w:w="3117" w:type="dxa"/>
+          </w:tcPr>
+          <w:p>
+            <m:oMath>
+              <m:f>
+                <m:fPr>
+                  <m:ctrlPr>
+                    <w:rPr>
+                      <w:rFonts w:ascii="Cambria Math" w:hAnsi="Cambria Math"/>
+                    </w:rPr>
+                  </m:ctrlPr>
+                </m:fPr>
+                <m:num>
+                  <m:r>
+                    <w:rPr>
+                      <w:rFonts w:ascii="Cambria Math" w:hAnsi="Cambria Math"/>
+                    </w:rPr>
+                    <m:t>0.012422</m:t>
+                  </m:r>
+                </m:num>
+                <m:den>
+                  <m:r>
+                    <w:rPr>
+                      <w:rFonts w:ascii="Cambria Math" w:hAnsi="Cambria Math"/>
+                    </w:rPr>
+                    <m:t>0.001176</m:t>
+                  </m:r>
+                </m:den>
+              </m:f>
+              <m:r>
+                <w:rPr>
+                  <w:rFonts w:ascii="Cambria Math" w:hAnsi="Cambria Math"/>
+                </w:rPr>
+                <m:t>≈10.56</m:t>
+              </m:r>
+            </m:oMath>
+            <w:r>
+              <w:t xml:space="preserve"> </w:t>
+            </w:r>
+          </w:p>
+        </w:tc>
+      </w:tr>
+    </w:tbl>
+    <w:p>
+      <w:pPr>
+        <w:rPr>
+          <w:i/>
+          <w:iCs/>
+        </w:rPr>
+      </w:pPr>
+      <w:r>
+        <w:rPr>
+          <w:i/>
+          <w:iCs/>
+        </w:rPr>
+        <w:t xml:space="preserve">*All methods </w:t>
+      </w:r>
+      <w:proofErr w:type="gramStart"/>
+      <w:r>
+        <w:rPr>
+          <w:i/>
+          <w:iCs/>
+        </w:rPr>
+        <w:t>show</w:t>
+      </w:r>
+      <w:proofErr w:type="gramEnd"/>
+      <w:r>
+        <w:rPr>
+          <w:i/>
+          <w:iCs/>
+        </w:rPr>
+        <w:t xml:space="preserve"> in the table </w:t>
+      </w:r>
+      <w:r>
+        <w:rPr>
+          <w:i/>
+          <w:iCs/>
+        </w:rPr>
+        <w:t>above</w:t>
+      </w:r>
+      <w:r>
+        <w:rPr>
+          <w:i/>
+          <w:iCs/>
+        </w:rPr>
+        <w:t xml:space="preserve"> show a </w:t>
+      </w:r>
+      <w:r>
+        <w:rPr>
+          <w:i/>
+          <w:iCs/>
+        </w:rPr>
+        <w:t xml:space="preserve">Ratio </w:t>
+      </w:r>
+      <w:r>
+        <w:rPr>
+          <w:i/>
+          <w:iCs/>
+        </w:rPr>
+        <w:t xml:space="preserve">of </w:t>
+      </w:r>
+      <w:r>
+        <w:rPr>
+          <w:i/>
+          <w:iCs/>
+        </w:rPr>
+        <w:t>≈ 10x change</w:t>
+      </w:r>
+      <w:r>
+        <w:rPr>
+          <w:i/>
+          <w:iCs/>
+        </w:rPr>
+        <w:t xml:space="preserve">, and all </w:t>
+      </w:r>
+      <w:proofErr w:type="gramStart"/>
+      <w:r>
+        <w:rPr>
+          <w:i/>
+          <w:iCs/>
+        </w:rPr>
+        <w:t>time-stamps</w:t>
+      </w:r>
+      <w:proofErr w:type="gramEnd"/>
+      <w:r>
+        <w:rPr>
+          <w:i/>
+          <w:iCs/>
+        </w:rPr>
+        <w:t xml:space="preserve"> are in seconds.</w:t>
+      </w:r>
+    </w:p>
+    <w:p/>
     <w:p>
       <w:pPr>
         <w:pStyle w:val="Heading2"/>
@@ -92,6 +2162,1136 @@
         <w:t>Interpretation</w:t>
       </w:r>
     </w:p>
+    <w:p>
+      <w:r>
+        <w:t>To be honest</w:t>
+      </w:r>
+      <w:r>
+        <w:t xml:space="preserve"> – I ran out of time to find my actual big-O costs. </w:t>
+      </w:r>
+    </w:p>
+    <w:p/>
+    <w:p>
+      <w:pPr>
+        <w:rPr>
+          <w:u w:val="single"/>
+        </w:rPr>
+      </w:pPr>
+      <w:r>
+        <w:rPr>
+          <w:u w:val="single"/>
+        </w:rPr>
+        <w:t xml:space="preserve">The </w:t>
+      </w:r>
+      <w:proofErr w:type="spellStart"/>
+      <w:r>
+        <w:rPr>
+          <w:u w:val="single"/>
+        </w:rPr>
+        <w:t>MasterColorMixer</w:t>
+      </w:r>
+      <w:proofErr w:type="spellEnd"/>
+      <w:r>
+        <w:rPr>
+          <w:u w:val="single"/>
+        </w:rPr>
+        <w:t xml:space="preserve"> project can utilize the following:</w:t>
+      </w:r>
+    </w:p>
+    <w:p>
+      <w:r>
+        <w:rPr>
+          <w:b/>
+          <w:bCs/>
+        </w:rPr>
+        <w:t xml:space="preserve">HashSet </w:t>
+      </w:r>
+      <w:r>
+        <w:t xml:space="preserve">– to provide constant-time checking to determine if a color has been unlocked. </w:t>
+      </w:r>
+    </w:p>
+    <w:p>
+      <w:proofErr w:type="spellStart"/>
+      <w:r>
+        <w:rPr>
+          <w:b/>
+          <w:bCs/>
+        </w:rPr>
+        <w:t>DynamicArray</w:t>
+      </w:r>
+      <w:proofErr w:type="spellEnd"/>
+      <w:r>
+        <w:rPr>
+          <w:b/>
+          <w:bCs/>
+        </w:rPr>
+        <w:t xml:space="preserve"> </w:t>
+      </w:r>
+      <w:r>
+        <w:t>or Queue – to support maintaining mixing history or other recent actions.</w:t>
+      </w:r>
+    </w:p>
+    <w:p>
+      <w:r>
+        <w:rPr>
+          <w:b/>
+          <w:bCs/>
+        </w:rPr>
+        <w:t xml:space="preserve">Stack </w:t>
+      </w:r>
+      <w:r>
+        <w:t xml:space="preserve">– to support undo actions like clearing the mixing area or clearing the palette. </w:t>
+      </w:r>
+    </w:p>
+    <w:p>
+      <w:r>
+        <w:tab/>
+      </w:r>
+      <w:proofErr w:type="spellStart"/>
+      <w:r>
+        <w:t>MasterColorMixer</w:t>
+      </w:r>
+      <w:proofErr w:type="spellEnd"/>
+      <w:r>
+        <w:t xml:space="preserve"> needs to be responsive, even on basic devices, so leveraging Python’s efficient internal structures can help ensure a predictable performance and user experience. I feel this is important because a toddler will likely prompt repeated interactions, voice triggers, and volatile color drag and drop. I need to ensure there is no delay in interactions and responses for the easiest learning experience.</w:t>
+      </w:r>
+    </w:p>
+    <w:p/>
+    <w:p/>
+    <w:p/>
+    <w:p/>
+    <w:p>
+      <w:pPr>
+        <w:pStyle w:val="Heading2"/>
+      </w:pPr>
+      <w:r>
+        <w:lastRenderedPageBreak/>
+        <w:t>References:</w:t>
+      </w:r>
+    </w:p>
+    <w:p>
+      <w:hyperlink r:id="rId6" w:history="1">
+        <w:r>
+          <w:rPr>
+            <w:rStyle w:val="Hyperlink"/>
+          </w:rPr>
+          <w:t>https://runestone.academy/ns/books/published/pythonds/index.html</w:t>
+        </w:r>
+      </w:hyperlink>
+    </w:p>
+    <w:p>
+      <w:pPr>
+        <w:rPr>
+          <w:b/>
+          <w:bCs/>
+        </w:rPr>
+      </w:pPr>
+    </w:p>
+    <w:p>
+      <w:pPr>
+        <w:rPr>
+          <w:b/>
+          <w:bCs/>
+        </w:rPr>
+      </w:pPr>
+      <w:r>
+        <w:rPr>
+          <w:b/>
+          <w:bCs/>
+        </w:rPr>
+        <w:t>List Time Complexity (Worst-Case)</w:t>
+      </w:r>
+    </w:p>
+    <w:p>
+      <w:r>
+        <w:t>Python lists are dynamic arrays, which offer fast indexing but slower insertions/deletions in the middle because elements need to be shifted. </w:t>
+      </w:r>
+    </w:p>
+    <w:tbl>
+      <w:tblPr>
+        <w:tblW w:w="9985" w:type="dxa"/>
+        <w:tblBorders>
+          <w:top w:val="single" w:sz="4" w:space="0" w:color="auto"/>
+          <w:left w:val="single" w:sz="4" w:space="0" w:color="auto"/>
+          <w:bottom w:val="single" w:sz="4" w:space="0" w:color="auto"/>
+          <w:right w:val="single" w:sz="4" w:space="0" w:color="auto"/>
+          <w:insideH w:val="single" w:sz="4" w:space="0" w:color="auto"/>
+          <w:insideV w:val="single" w:sz="4" w:space="0" w:color="auto"/>
+        </w:tblBorders>
+        <w:tblCellMar>
+          <w:top w:w="15" w:type="dxa"/>
+          <w:left w:w="15" w:type="dxa"/>
+          <w:bottom w:w="15" w:type="dxa"/>
+          <w:right w:w="15" w:type="dxa"/>
+        </w:tblCellMar>
+        <w:tblLook w:val="04A0" w:firstRow="1" w:lastRow="0" w:firstColumn="1" w:lastColumn="0" w:noHBand="0" w:noVBand="1"/>
+      </w:tblPr>
+      <w:tblGrid>
+        <w:gridCol w:w="3104"/>
+        <w:gridCol w:w="2021"/>
+        <w:gridCol w:w="4860"/>
+      </w:tblGrid>
+      <w:tr>
+        <w:tc>
+          <w:tcPr>
+            <w:tcW w:w="3104" w:type="dxa"/>
+            <w:tcMar>
+              <w:top w:w="120" w:type="dxa"/>
+              <w:left w:w="0" w:type="dxa"/>
+              <w:bottom w:w="120" w:type="dxa"/>
+              <w:right w:w="240" w:type="dxa"/>
+            </w:tcMar>
+            <w:hideMark/>
+          </w:tcPr>
+          <w:p>
+            <w:r>
+              <w:t>Operation </w:t>
+            </w:r>
+          </w:p>
+        </w:tc>
+        <w:tc>
+          <w:tcPr>
+            <w:tcW w:w="2021" w:type="dxa"/>
+            <w:tcMar>
+              <w:top w:w="120" w:type="dxa"/>
+              <w:left w:w="0" w:type="dxa"/>
+              <w:bottom w:w="120" w:type="dxa"/>
+              <w:right w:w="240" w:type="dxa"/>
+            </w:tcMar>
+            <w:hideMark/>
+          </w:tcPr>
+          <w:p>
+            <w:r>
+              <w:t>Time Complexity</w:t>
+            </w:r>
+          </w:p>
+        </w:tc>
+        <w:tc>
+          <w:tcPr>
+            <w:tcW w:w="4860" w:type="dxa"/>
+            <w:tcMar>
+              <w:top w:w="120" w:type="dxa"/>
+              <w:left w:w="0" w:type="dxa"/>
+              <w:bottom w:w="120" w:type="dxa"/>
+              <w:right w:w="0" w:type="dxa"/>
+            </w:tcMar>
+            <w:hideMark/>
+          </w:tcPr>
+          <w:p>
+            <w:r>
+              <w:t>Description</w:t>
+            </w:r>
+          </w:p>
+        </w:tc>
+      </w:tr>
+      <w:tr>
+        <w:tc>
+          <w:tcPr>
+            <w:tcW w:w="3104" w:type="dxa"/>
+            <w:tcMar>
+              <w:top w:w="180" w:type="dxa"/>
+              <w:left w:w="0" w:type="dxa"/>
+              <w:bottom w:w="180" w:type="dxa"/>
+              <w:right w:w="240" w:type="dxa"/>
+            </w:tcMar>
+            <w:hideMark/>
+          </w:tcPr>
+          <w:p>
+            <w:r>
+              <w:rPr>
+                <w:b/>
+                <w:bCs/>
+              </w:rPr>
+              <w:t>Index Access/Assignment</w:t>
+            </w:r>
+            <w:r>
+              <w:t> (list[</w:t>
+            </w:r>
+            <w:proofErr w:type="spellStart"/>
+            <w:r>
+              <w:t>i</w:t>
+            </w:r>
+            <w:proofErr w:type="spellEnd"/>
+            <w:r>
+              <w:t>])</w:t>
+            </w:r>
+          </w:p>
+        </w:tc>
+        <w:tc>
+          <w:tcPr>
+            <w:tcW w:w="2021" w:type="dxa"/>
+            <w:tcMar>
+              <w:top w:w="180" w:type="dxa"/>
+              <w:left w:w="0" w:type="dxa"/>
+              <w:bottom w:w="180" w:type="dxa"/>
+              <w:right w:w="240" w:type="dxa"/>
+            </w:tcMar>
+            <w:hideMark/>
+          </w:tcPr>
+          <w:p>
+            <w:proofErr w:type="gramStart"/>
+            <w:r>
+              <w:rPr>
+                <w:b/>
+                <w:bCs/>
+              </w:rPr>
+              <w:t>O(</w:t>
+            </w:r>
+            <w:proofErr w:type="gramEnd"/>
+            <w:r>
+              <w:rPr>
+                <w:b/>
+                <w:bCs/>
+              </w:rPr>
+              <w:t>1)</w:t>
+            </w:r>
+          </w:p>
+        </w:tc>
+        <w:tc>
+          <w:tcPr>
+            <w:tcW w:w="4860" w:type="dxa"/>
+            <w:tcMar>
+              <w:top w:w="180" w:type="dxa"/>
+              <w:left w:w="0" w:type="dxa"/>
+              <w:bottom w:w="180" w:type="dxa"/>
+              <w:right w:w="0" w:type="dxa"/>
+            </w:tcMar>
+            <w:hideMark/>
+          </w:tcPr>
+          <w:p>
+            <w:r>
+              <w:t>Direct access to an element by its index is constant time.</w:t>
+            </w:r>
+          </w:p>
+        </w:tc>
+      </w:tr>
+      <w:tr>
+        <w:tc>
+          <w:tcPr>
+            <w:tcW w:w="3104" w:type="dxa"/>
+            <w:tcMar>
+              <w:top w:w="180" w:type="dxa"/>
+              <w:left w:w="0" w:type="dxa"/>
+              <w:bottom w:w="180" w:type="dxa"/>
+              <w:right w:w="240" w:type="dxa"/>
+            </w:tcMar>
+            <w:hideMark/>
+          </w:tcPr>
+          <w:p>
+            <w:proofErr w:type="gramStart"/>
+            <w:r>
+              <w:rPr>
+                <w:b/>
+                <w:bCs/>
+              </w:rPr>
+              <w:t>append(</w:t>
+            </w:r>
+            <w:proofErr w:type="gramEnd"/>
+            <w:r>
+              <w:rPr>
+                <w:b/>
+                <w:bCs/>
+              </w:rPr>
+              <w:t>)</w:t>
+            </w:r>
+            <w:r>
+              <w:t> (to end)</w:t>
+            </w:r>
+          </w:p>
+        </w:tc>
+        <w:tc>
+          <w:tcPr>
+            <w:tcW w:w="2021" w:type="dxa"/>
+            <w:tcMar>
+              <w:top w:w="180" w:type="dxa"/>
+              <w:left w:w="0" w:type="dxa"/>
+              <w:bottom w:w="180" w:type="dxa"/>
+              <w:right w:w="240" w:type="dxa"/>
+            </w:tcMar>
+            <w:hideMark/>
+          </w:tcPr>
+          <w:p>
+            <w:proofErr w:type="gramStart"/>
+            <w:r>
+              <w:rPr>
+                <w:b/>
+                <w:bCs/>
+              </w:rPr>
+              <w:t>O(</w:t>
+            </w:r>
+            <w:proofErr w:type="gramEnd"/>
+            <w:r>
+              <w:rPr>
+                <w:b/>
+                <w:bCs/>
+              </w:rPr>
+              <w:t>1)</w:t>
+            </w:r>
+            <w:r>
+              <w:t> (amortized)</w:t>
+            </w:r>
+          </w:p>
+        </w:tc>
+        <w:tc>
+          <w:tcPr>
+            <w:tcW w:w="4860" w:type="dxa"/>
+            <w:tcMar>
+              <w:top w:w="180" w:type="dxa"/>
+              <w:left w:w="0" w:type="dxa"/>
+              <w:bottom w:w="180" w:type="dxa"/>
+              <w:right w:w="0" w:type="dxa"/>
+            </w:tcMar>
+            <w:hideMark/>
+          </w:tcPr>
+          <w:p>
+            <w:r>
+              <w:t>Amortized constant time; occasionally O(n) when the list needs resizing.</w:t>
+            </w:r>
+          </w:p>
+        </w:tc>
+      </w:tr>
+      <w:tr>
+        <w:tc>
+          <w:tcPr>
+            <w:tcW w:w="3104" w:type="dxa"/>
+            <w:tcMar>
+              <w:top w:w="180" w:type="dxa"/>
+              <w:left w:w="0" w:type="dxa"/>
+              <w:bottom w:w="180" w:type="dxa"/>
+              <w:right w:w="240" w:type="dxa"/>
+            </w:tcMar>
+            <w:hideMark/>
+          </w:tcPr>
+          <w:p>
+            <w:proofErr w:type="gramStart"/>
+            <w:r>
+              <w:rPr>
+                <w:b/>
+                <w:bCs/>
+              </w:rPr>
+              <w:t>pop(</w:t>
+            </w:r>
+            <w:proofErr w:type="gramEnd"/>
+            <w:r>
+              <w:rPr>
+                <w:b/>
+                <w:bCs/>
+              </w:rPr>
+              <w:t>)</w:t>
+            </w:r>
+            <w:r>
+              <w:t> (from end)</w:t>
+            </w:r>
+          </w:p>
+        </w:tc>
+        <w:tc>
+          <w:tcPr>
+            <w:tcW w:w="2021" w:type="dxa"/>
+            <w:tcMar>
+              <w:top w:w="180" w:type="dxa"/>
+              <w:left w:w="0" w:type="dxa"/>
+              <w:bottom w:w="180" w:type="dxa"/>
+              <w:right w:w="240" w:type="dxa"/>
+            </w:tcMar>
+            <w:hideMark/>
+          </w:tcPr>
+          <w:p>
+            <w:proofErr w:type="gramStart"/>
+            <w:r>
+              <w:rPr>
+                <w:b/>
+                <w:bCs/>
+              </w:rPr>
+              <w:t>O(</w:t>
+            </w:r>
+            <w:proofErr w:type="gramEnd"/>
+            <w:r>
+              <w:rPr>
+                <w:b/>
+                <w:bCs/>
+              </w:rPr>
+              <w:t>1)</w:t>
+            </w:r>
+          </w:p>
+        </w:tc>
+        <w:tc>
+          <w:tcPr>
+            <w:tcW w:w="4860" w:type="dxa"/>
+            <w:tcMar>
+              <w:top w:w="180" w:type="dxa"/>
+              <w:left w:w="0" w:type="dxa"/>
+              <w:bottom w:w="180" w:type="dxa"/>
+              <w:right w:w="0" w:type="dxa"/>
+            </w:tcMar>
+            <w:hideMark/>
+          </w:tcPr>
+          <w:p>
+            <w:r>
+              <w:t>Removing the last element is constant time.</w:t>
+            </w:r>
+          </w:p>
+        </w:tc>
+      </w:tr>
+      <w:tr>
+        <w:tc>
+          <w:tcPr>
+            <w:tcW w:w="3104" w:type="dxa"/>
+            <w:tcMar>
+              <w:top w:w="180" w:type="dxa"/>
+              <w:left w:w="0" w:type="dxa"/>
+              <w:bottom w:w="180" w:type="dxa"/>
+              <w:right w:w="240" w:type="dxa"/>
+            </w:tcMar>
+            <w:hideMark/>
+          </w:tcPr>
+          <w:p>
+            <w:proofErr w:type="gramStart"/>
+            <w:r>
+              <w:rPr>
+                <w:b/>
+                <w:bCs/>
+              </w:rPr>
+              <w:t>insert(</w:t>
+            </w:r>
+            <w:proofErr w:type="gramEnd"/>
+            <w:r>
+              <w:rPr>
+                <w:b/>
+                <w:bCs/>
+              </w:rPr>
+              <w:t>)</w:t>
+            </w:r>
+            <w:r>
+              <w:t> (at index </w:t>
+            </w:r>
+            <w:proofErr w:type="spellStart"/>
+            <w:r>
+              <w:t>i</w:t>
+            </w:r>
+            <w:proofErr w:type="spellEnd"/>
+            <w:r>
+              <w:t>)</w:t>
+            </w:r>
+          </w:p>
+        </w:tc>
+        <w:tc>
+          <w:tcPr>
+            <w:tcW w:w="2021" w:type="dxa"/>
+            <w:tcMar>
+              <w:top w:w="180" w:type="dxa"/>
+              <w:left w:w="0" w:type="dxa"/>
+              <w:bottom w:w="180" w:type="dxa"/>
+              <w:right w:w="240" w:type="dxa"/>
+            </w:tcMar>
+            <w:hideMark/>
+          </w:tcPr>
+          <w:p>
+            <w:r>
+              <w:rPr>
+                <w:b/>
+                <w:bCs/>
+              </w:rPr>
+              <w:t>O(n)</w:t>
+            </w:r>
+          </w:p>
+        </w:tc>
+        <w:tc>
+          <w:tcPr>
+            <w:tcW w:w="4860" w:type="dxa"/>
+            <w:tcMar>
+              <w:top w:w="180" w:type="dxa"/>
+              <w:left w:w="0" w:type="dxa"/>
+              <w:bottom w:w="180" w:type="dxa"/>
+              <w:right w:w="0" w:type="dxa"/>
+            </w:tcMar>
+            <w:hideMark/>
+          </w:tcPr>
+          <w:p>
+            <w:r>
+              <w:t xml:space="preserve">Linear </w:t>
+            </w:r>
+            <w:proofErr w:type="gramStart"/>
+            <w:r>
+              <w:t>time;</w:t>
+            </w:r>
+            <w:proofErr w:type="gramEnd"/>
+            <w:r>
+              <w:t xml:space="preserve"> all subsequent elements must be shifted.</w:t>
+            </w:r>
+          </w:p>
+        </w:tc>
+      </w:tr>
+      <w:tr>
+        <w:tc>
+          <w:tcPr>
+            <w:tcW w:w="3104" w:type="dxa"/>
+            <w:tcMar>
+              <w:top w:w="180" w:type="dxa"/>
+              <w:left w:w="0" w:type="dxa"/>
+              <w:bottom w:w="180" w:type="dxa"/>
+              <w:right w:w="240" w:type="dxa"/>
+            </w:tcMar>
+            <w:hideMark/>
+          </w:tcPr>
+          <w:p>
+            <w:proofErr w:type="gramStart"/>
+            <w:r>
+              <w:rPr>
+                <w:b/>
+                <w:bCs/>
+              </w:rPr>
+              <w:t>pop(</w:t>
+            </w:r>
+            <w:proofErr w:type="gramEnd"/>
+            <w:r>
+              <w:rPr>
+                <w:b/>
+                <w:bCs/>
+              </w:rPr>
+              <w:t>)</w:t>
+            </w:r>
+            <w:r>
+              <w:t> (from index </w:t>
+            </w:r>
+            <w:proofErr w:type="spellStart"/>
+            <w:r>
+              <w:t>i</w:t>
+            </w:r>
+            <w:proofErr w:type="spellEnd"/>
+            <w:r>
+              <w:t>)</w:t>
+            </w:r>
+          </w:p>
+        </w:tc>
+        <w:tc>
+          <w:tcPr>
+            <w:tcW w:w="2021" w:type="dxa"/>
+            <w:tcMar>
+              <w:top w:w="180" w:type="dxa"/>
+              <w:left w:w="0" w:type="dxa"/>
+              <w:bottom w:w="180" w:type="dxa"/>
+              <w:right w:w="240" w:type="dxa"/>
+            </w:tcMar>
+            <w:hideMark/>
+          </w:tcPr>
+          <w:p>
+            <w:r>
+              <w:rPr>
+                <w:b/>
+                <w:bCs/>
+              </w:rPr>
+              <w:t>O(n)</w:t>
+            </w:r>
+          </w:p>
+        </w:tc>
+        <w:tc>
+          <w:tcPr>
+            <w:tcW w:w="4860" w:type="dxa"/>
+            <w:tcMar>
+              <w:top w:w="180" w:type="dxa"/>
+              <w:left w:w="0" w:type="dxa"/>
+              <w:bottom w:w="180" w:type="dxa"/>
+              <w:right w:w="0" w:type="dxa"/>
+            </w:tcMar>
+            <w:hideMark/>
+          </w:tcPr>
+          <w:p>
+            <w:r>
+              <w:t xml:space="preserve">Linear </w:t>
+            </w:r>
+            <w:proofErr w:type="gramStart"/>
+            <w:r>
+              <w:t>time;</w:t>
+            </w:r>
+            <w:proofErr w:type="gramEnd"/>
+            <w:r>
+              <w:t xml:space="preserve"> all subsequent elements must be shifted.</w:t>
+            </w:r>
+          </w:p>
+        </w:tc>
+      </w:tr>
+      <w:tr>
+        <w:tc>
+          <w:tcPr>
+            <w:tcW w:w="3104" w:type="dxa"/>
+            <w:tcMar>
+              <w:top w:w="180" w:type="dxa"/>
+              <w:left w:w="0" w:type="dxa"/>
+              <w:bottom w:w="180" w:type="dxa"/>
+              <w:right w:w="240" w:type="dxa"/>
+            </w:tcMar>
+            <w:hideMark/>
+          </w:tcPr>
+          <w:p>
+            <w:proofErr w:type="gramStart"/>
+            <w:r>
+              <w:rPr>
+                <w:b/>
+                <w:bCs/>
+              </w:rPr>
+              <w:t>remove(</w:t>
+            </w:r>
+            <w:proofErr w:type="gramEnd"/>
+            <w:r>
+              <w:rPr>
+                <w:b/>
+                <w:bCs/>
+              </w:rPr>
+              <w:t>)</w:t>
+            </w:r>
+            <w:r>
+              <w:t> (by value)</w:t>
+            </w:r>
+          </w:p>
+        </w:tc>
+        <w:tc>
+          <w:tcPr>
+            <w:tcW w:w="2021" w:type="dxa"/>
+            <w:tcMar>
+              <w:top w:w="180" w:type="dxa"/>
+              <w:left w:w="0" w:type="dxa"/>
+              <w:bottom w:w="180" w:type="dxa"/>
+              <w:right w:w="240" w:type="dxa"/>
+            </w:tcMar>
+            <w:hideMark/>
+          </w:tcPr>
+          <w:p>
+            <w:r>
+              <w:rPr>
+                <w:b/>
+                <w:bCs/>
+              </w:rPr>
+              <w:t>O(n)</w:t>
+            </w:r>
+          </w:p>
+        </w:tc>
+        <w:tc>
+          <w:tcPr>
+            <w:tcW w:w="4860" w:type="dxa"/>
+            <w:tcMar>
+              <w:top w:w="180" w:type="dxa"/>
+              <w:left w:w="0" w:type="dxa"/>
+              <w:bottom w:w="180" w:type="dxa"/>
+              <w:right w:w="0" w:type="dxa"/>
+            </w:tcMar>
+            <w:hideMark/>
+          </w:tcPr>
+          <w:p>
+            <w:r>
+              <w:t>Linear time; requires searching for the element first.</w:t>
+            </w:r>
+          </w:p>
+        </w:tc>
+      </w:tr>
+      <w:tr>
+        <w:tc>
+          <w:tcPr>
+            <w:tcW w:w="3104" w:type="dxa"/>
+            <w:tcMar>
+              <w:top w:w="180" w:type="dxa"/>
+              <w:left w:w="0" w:type="dxa"/>
+              <w:bottom w:w="180" w:type="dxa"/>
+              <w:right w:w="240" w:type="dxa"/>
+            </w:tcMar>
+            <w:hideMark/>
+          </w:tcPr>
+          <w:p>
+            <w:r>
+              <w:rPr>
+                <w:b/>
+                <w:bCs/>
+              </w:rPr>
+              <w:t>Search</w:t>
+            </w:r>
+            <w:r>
+              <w:t> (value in list)</w:t>
+            </w:r>
+          </w:p>
+        </w:tc>
+        <w:tc>
+          <w:tcPr>
+            <w:tcW w:w="2021" w:type="dxa"/>
+            <w:tcMar>
+              <w:top w:w="180" w:type="dxa"/>
+              <w:left w:w="0" w:type="dxa"/>
+              <w:bottom w:w="180" w:type="dxa"/>
+              <w:right w:w="240" w:type="dxa"/>
+            </w:tcMar>
+            <w:hideMark/>
+          </w:tcPr>
+          <w:p>
+            <w:r>
+              <w:rPr>
+                <w:b/>
+                <w:bCs/>
+              </w:rPr>
+              <w:t>O(n)</w:t>
+            </w:r>
+          </w:p>
+        </w:tc>
+        <w:tc>
+          <w:tcPr>
+            <w:tcW w:w="4860" w:type="dxa"/>
+            <w:tcMar>
+              <w:top w:w="180" w:type="dxa"/>
+              <w:left w:w="0" w:type="dxa"/>
+              <w:bottom w:w="180" w:type="dxa"/>
+              <w:right w:w="0" w:type="dxa"/>
+            </w:tcMar>
+            <w:hideMark/>
+          </w:tcPr>
+          <w:p>
+            <w:r>
+              <w:t>Linear time; may need to check every element.</w:t>
+            </w:r>
+          </w:p>
+        </w:tc>
+      </w:tr>
+      <w:tr>
+        <w:tc>
+          <w:tcPr>
+            <w:tcW w:w="3104" w:type="dxa"/>
+            <w:tcMar>
+              <w:top w:w="180" w:type="dxa"/>
+              <w:left w:w="0" w:type="dxa"/>
+              <w:bottom w:w="180" w:type="dxa"/>
+              <w:right w:w="240" w:type="dxa"/>
+            </w:tcMar>
+            <w:hideMark/>
+          </w:tcPr>
+          <w:p>
+            <w:r>
+              <w:rPr>
+                <w:b/>
+                <w:bCs/>
+              </w:rPr>
+              <w:t>Iteration</w:t>
+            </w:r>
+            <w:r>
+              <w:t> (for item in list)</w:t>
+            </w:r>
+          </w:p>
+        </w:tc>
+        <w:tc>
+          <w:tcPr>
+            <w:tcW w:w="2021" w:type="dxa"/>
+            <w:tcMar>
+              <w:top w:w="180" w:type="dxa"/>
+              <w:left w:w="0" w:type="dxa"/>
+              <w:bottom w:w="180" w:type="dxa"/>
+              <w:right w:w="240" w:type="dxa"/>
+            </w:tcMar>
+            <w:hideMark/>
+          </w:tcPr>
+          <w:p>
+            <w:r>
+              <w:rPr>
+                <w:b/>
+                <w:bCs/>
+              </w:rPr>
+              <w:t>O(n)</w:t>
+            </w:r>
+          </w:p>
+        </w:tc>
+        <w:tc>
+          <w:tcPr>
+            <w:tcW w:w="4860" w:type="dxa"/>
+            <w:tcMar>
+              <w:top w:w="180" w:type="dxa"/>
+              <w:left w:w="0" w:type="dxa"/>
+              <w:bottom w:w="180" w:type="dxa"/>
+              <w:right w:w="0" w:type="dxa"/>
+            </w:tcMar>
+            <w:hideMark/>
+          </w:tcPr>
+          <w:p>
+            <w:r>
+              <w:t>Linear time; processes each element once.</w:t>
+            </w:r>
+          </w:p>
+        </w:tc>
+      </w:tr>
+      <w:tr>
+        <w:tc>
+          <w:tcPr>
+            <w:tcW w:w="3104" w:type="dxa"/>
+            <w:tcMar>
+              <w:top w:w="180" w:type="dxa"/>
+              <w:left w:w="0" w:type="dxa"/>
+              <w:bottom w:w="180" w:type="dxa"/>
+              <w:right w:w="240" w:type="dxa"/>
+            </w:tcMar>
+            <w:hideMark/>
+          </w:tcPr>
+          <w:p>
+            <w:proofErr w:type="gramStart"/>
+            <w:r>
+              <w:rPr>
+                <w:b/>
+                <w:bCs/>
+              </w:rPr>
+              <w:lastRenderedPageBreak/>
+              <w:t>sort(</w:t>
+            </w:r>
+            <w:proofErr w:type="gramEnd"/>
+            <w:r>
+              <w:rPr>
+                <w:b/>
+                <w:bCs/>
+              </w:rPr>
+              <w:t>)</w:t>
+            </w:r>
+            <w:r>
+              <w:t> (</w:t>
+            </w:r>
+            <w:proofErr w:type="spellStart"/>
+            <w:proofErr w:type="gramStart"/>
+            <w:r>
+              <w:t>list.sort</w:t>
+            </w:r>
+            <w:proofErr w:type="spellEnd"/>
+            <w:proofErr w:type="gramEnd"/>
+            <w:r>
+              <w:t>())</w:t>
+            </w:r>
+          </w:p>
+        </w:tc>
+        <w:tc>
+          <w:tcPr>
+            <w:tcW w:w="2021" w:type="dxa"/>
+            <w:tcMar>
+              <w:top w:w="180" w:type="dxa"/>
+              <w:left w:w="0" w:type="dxa"/>
+              <w:bottom w:w="180" w:type="dxa"/>
+              <w:right w:w="240" w:type="dxa"/>
+            </w:tcMar>
+            <w:hideMark/>
+          </w:tcPr>
+          <w:p>
+            <w:proofErr w:type="gramStart"/>
+            <w:r>
+              <w:rPr>
+                <w:b/>
+                <w:bCs/>
+              </w:rPr>
+              <w:t>O(</w:t>
+            </w:r>
+            <w:proofErr w:type="gramEnd"/>
+            <w:r>
+              <w:rPr>
+                <w:b/>
+                <w:bCs/>
+              </w:rPr>
+              <w:t>n log n)</w:t>
+            </w:r>
+          </w:p>
+        </w:tc>
+        <w:tc>
+          <w:tcPr>
+            <w:tcW w:w="4860" w:type="dxa"/>
+            <w:tcMar>
+              <w:top w:w="180" w:type="dxa"/>
+              <w:left w:w="0" w:type="dxa"/>
+              <w:bottom w:w="180" w:type="dxa"/>
+              <w:right w:w="0" w:type="dxa"/>
+            </w:tcMar>
+            <w:hideMark/>
+          </w:tcPr>
+          <w:p>
+            <w:r>
+              <w:t xml:space="preserve">Uses </w:t>
+            </w:r>
+            <w:proofErr w:type="spellStart"/>
+            <w:r>
+              <w:t>Timsort</w:t>
+            </w:r>
+            <w:proofErr w:type="spellEnd"/>
+            <w:r>
+              <w:t>, an efficient hybrid sorting algorithm.</w:t>
+            </w:r>
+          </w:p>
+        </w:tc>
+      </w:tr>
+      <w:tr>
+        <w:tc>
+          <w:tcPr>
+            <w:tcW w:w="3104" w:type="dxa"/>
+            <w:tcMar>
+              <w:top w:w="180" w:type="dxa"/>
+              <w:left w:w="0" w:type="dxa"/>
+              <w:bottom w:w="180" w:type="dxa"/>
+              <w:right w:w="240" w:type="dxa"/>
+            </w:tcMar>
+            <w:hideMark/>
+          </w:tcPr>
+          <w:p>
+            <w:proofErr w:type="spellStart"/>
+            <w:proofErr w:type="gramStart"/>
+            <w:r>
+              <w:rPr>
+                <w:b/>
+                <w:bCs/>
+              </w:rPr>
+              <w:t>len</w:t>
+            </w:r>
+            <w:proofErr w:type="spellEnd"/>
+            <w:r>
+              <w:rPr>
+                <w:b/>
+                <w:bCs/>
+              </w:rPr>
+              <w:t>(</w:t>
+            </w:r>
+            <w:proofErr w:type="gramEnd"/>
+            <w:r>
+              <w:rPr>
+                <w:b/>
+                <w:bCs/>
+              </w:rPr>
+              <w:t>)</w:t>
+            </w:r>
+          </w:p>
+        </w:tc>
+        <w:tc>
+          <w:tcPr>
+            <w:tcW w:w="2021" w:type="dxa"/>
+            <w:tcMar>
+              <w:top w:w="180" w:type="dxa"/>
+              <w:left w:w="0" w:type="dxa"/>
+              <w:bottom w:w="180" w:type="dxa"/>
+              <w:right w:w="240" w:type="dxa"/>
+            </w:tcMar>
+            <w:hideMark/>
+          </w:tcPr>
+          <w:p>
+            <w:proofErr w:type="gramStart"/>
+            <w:r>
+              <w:rPr>
+                <w:b/>
+                <w:bCs/>
+              </w:rPr>
+              <w:t>O(</w:t>
+            </w:r>
+            <w:proofErr w:type="gramEnd"/>
+            <w:r>
+              <w:rPr>
+                <w:b/>
+                <w:bCs/>
+              </w:rPr>
+              <w:t>1)</w:t>
+            </w:r>
+          </w:p>
+        </w:tc>
+        <w:tc>
+          <w:tcPr>
+            <w:tcW w:w="4860" w:type="dxa"/>
+            <w:tcMar>
+              <w:top w:w="180" w:type="dxa"/>
+              <w:left w:w="0" w:type="dxa"/>
+              <w:bottom w:w="180" w:type="dxa"/>
+              <w:right w:w="0" w:type="dxa"/>
+            </w:tcMar>
+            <w:hideMark/>
+          </w:tcPr>
+          <w:p>
+            <w:r>
+              <w:t>Length is stored and accessed directly.</w:t>
+            </w:r>
+          </w:p>
+        </w:tc>
+      </w:tr>
+      <w:tr>
+        <w:tc>
+          <w:tcPr>
+            <w:tcW w:w="3104" w:type="dxa"/>
+            <w:tcMar>
+              <w:top w:w="180" w:type="dxa"/>
+              <w:left w:w="0" w:type="dxa"/>
+              <w:bottom w:w="180" w:type="dxa"/>
+              <w:right w:w="240" w:type="dxa"/>
+            </w:tcMar>
+            <w:hideMark/>
+          </w:tcPr>
+          <w:p>
+            <w:r>
+              <w:rPr>
+                <w:b/>
+                <w:bCs/>
+              </w:rPr>
+              <w:t>Copy</w:t>
+            </w:r>
+            <w:r>
+              <w:t> (</w:t>
+            </w:r>
+            <w:proofErr w:type="gramStart"/>
+            <w:r>
+              <w:t>list[</w:t>
+            </w:r>
+            <w:proofErr w:type="gramEnd"/>
+            <w:r>
+              <w:t>:] or </w:t>
+            </w:r>
+            <w:proofErr w:type="spellStart"/>
+            <w:proofErr w:type="gramStart"/>
+            <w:r>
+              <w:t>list.copy</w:t>
+            </w:r>
+            <w:proofErr w:type="spellEnd"/>
+            <w:proofErr w:type="gramEnd"/>
+            <w:r>
+              <w:t>())</w:t>
+            </w:r>
+          </w:p>
+        </w:tc>
+        <w:tc>
+          <w:tcPr>
+            <w:tcW w:w="2021" w:type="dxa"/>
+            <w:tcMar>
+              <w:top w:w="180" w:type="dxa"/>
+              <w:left w:w="0" w:type="dxa"/>
+              <w:bottom w:w="180" w:type="dxa"/>
+              <w:right w:w="240" w:type="dxa"/>
+            </w:tcMar>
+            <w:hideMark/>
+          </w:tcPr>
+          <w:p>
+            <w:r>
+              <w:rPr>
+                <w:b/>
+                <w:bCs/>
+              </w:rPr>
+              <w:t>O(n)</w:t>
+            </w:r>
+          </w:p>
+        </w:tc>
+        <w:tc>
+          <w:tcPr>
+            <w:tcW w:w="4860" w:type="dxa"/>
+            <w:tcMar>
+              <w:top w:w="180" w:type="dxa"/>
+              <w:left w:w="0" w:type="dxa"/>
+              <w:bottom w:w="180" w:type="dxa"/>
+              <w:right w:w="0" w:type="dxa"/>
+            </w:tcMar>
+            <w:hideMark/>
+          </w:tcPr>
+          <w:p>
+            <w:r>
+              <w:t xml:space="preserve">Linear </w:t>
+            </w:r>
+            <w:proofErr w:type="gramStart"/>
+            <w:r>
+              <w:t>time;</w:t>
+            </w:r>
+            <w:proofErr w:type="gramEnd"/>
+            <w:r>
+              <w:t xml:space="preserve"> all elements must be copied.</w:t>
+            </w:r>
+          </w:p>
+        </w:tc>
+      </w:tr>
+    </w:tbl>
+    <w:p/>
     <w:sectPr>
       <w:pgSz w:w="12240" w:h="15840"/>
       <w:pgMar w:top="1440" w:right="1440" w:bottom="1440" w:left="1440" w:header="720" w:footer="720" w:gutter="0"/>
@@ -100,6 +3300,163 @@
     </w:sectPr>
   </w:body>
 </w:document>
+</file>
+
+<file path=word/numbering.xml><?xml version="1.0" encoding="utf-8"?>
+<w:numbering xmlns:wpc="http://schemas.microsoft.com/office/word/2010/wordprocessingCanvas" xmlns:cx="http://schemas.microsoft.com/office/drawing/2014/chartex" xmlns:cx1="http://schemas.microsoft.com/office/drawing/2015/9/8/chartex" xmlns:cx2="http://schemas.microsoft.com/office/drawing/2015/10/21/chartex" xmlns:cx3="http://schemas.microsoft.com/office/drawing/2016/5/9/chartex" xmlns:cx4="http://schemas.microsoft.com/office/drawing/2016/5/10/chartex" xmlns:cx5="http://schemas.microsoft.com/office/drawing/2016/5/11/chartex" xmlns:cx6="http://schemas.microsoft.com/office/drawing/2016/5/12/chartex" xmlns:cx7="http://schemas.microsoft.com/office/drawing/2016/5/13/chartex" xmlns:cx8="http://schemas.microsoft.com/office/drawing/2016/5/14/chartex" xmlns:mc="http://schemas.openxmlformats.org/markup-compatibility/2006" xmlns:aink="http://schemas.microsoft.com/office/drawing/2016/ink" xmlns:am3d="http://schemas.microsoft.com/office/drawing/2017/model3d" xmlns:o="urn:schemas-microsoft-com:office:office" xmlns:oel="http://schemas.microsoft.com/office/2019/extlst" xmlns:r="http://schemas.openxmlformats.org/officeDocument/2006/relationships" xmlns:m="http://schemas.openxmlformats.org/officeDocument/2006/math" xmlns:v="urn:schemas-microsoft-com:vml" xmlns:wp14="http://schemas.microsoft.com/office/word/2010/wordprocessingDrawing" xmlns:wp="http://schemas.openxmlformats.org/drawingml/2006/wordprocessingDrawing" xmlns:w10="urn:schemas-microsoft-com:office:word" xmlns:w="http://schemas.openxmlformats.org/wordprocessingml/2006/main" xmlns:w14="http://schemas.microsoft.com/office/word/2010/wordml" xmlns:w15="http://schemas.microsoft.com/office/word/2012/wordml" xmlns:w16cex="http://schemas.microsoft.com/office/word/2018/wordml/cex" xmlns:w16cid="http://schemas.microsoft.com/office/word/2016/wordml/cid" xmlns:w16="http://schemas.microsoft.com/office/word/2018/wordml" xmlns:w16du="http://schemas.microsoft.com/office/word/2023/wordml/word16du" xmlns:w16sdtdh="http://schemas.microsoft.com/office/word/2020/wordml/sdtdatahash" xmlns:w16sdtfl="http://schemas.microsoft.com/office/word/2024/wordml/sdtformatlock" xmlns:w16se="http://schemas.microsoft.com/office/word/2015/wordml/symex" xmlns:wpg="http://schemas.microsoft.com/office/word/2010/wordprocessingGroup" xmlns:wpi="http://schemas.microsoft.com/office/word/2010/wordprocessingInk" xmlns:wne="http://schemas.microsoft.com/office/word/2006/wordml" xmlns:wps="http://schemas.microsoft.com/office/word/2010/wordprocessingShape" mc:Ignorable="w14 w15 w16se w16cid w16 w16cex w16sdtdh w16sdtfl w16du wp14">
+  <w:abstractNum w:abstractNumId="0" w15:restartNumberingAfterBreak="0">
+    <w:nsid w:val="25AC6B37"/>
+    <w:multiLevelType w:val="multilevel"/>
+    <w:tmpl w:val="C3FE615E"/>
+    <w:lvl w:ilvl="0">
+      <w:start w:val="1"/>
+      <w:numFmt w:val="bullet"/>
+      <w:lvlText w:val=""/>
+      <w:lvlJc w:val="left"/>
+      <w:pPr>
+        <w:tabs>
+          <w:tab w:val="num" w:pos="720"/>
+        </w:tabs>
+        <w:ind w:left="720" w:hanging="360"/>
+      </w:pPr>
+      <w:rPr>
+        <w:rFonts w:ascii="Symbol" w:hAnsi="Symbol" w:hint="default"/>
+        <w:sz w:val="20"/>
+      </w:rPr>
+    </w:lvl>
+    <w:lvl w:ilvl="1" w:tentative="1">
+      <w:start w:val="1"/>
+      <w:numFmt w:val="bullet"/>
+      <w:lvlText w:val="o"/>
+      <w:lvlJc w:val="left"/>
+      <w:pPr>
+        <w:tabs>
+          <w:tab w:val="num" w:pos="1440"/>
+        </w:tabs>
+        <w:ind w:left="1440" w:hanging="360"/>
+      </w:pPr>
+      <w:rPr>
+        <w:rFonts w:ascii="Courier New" w:hAnsi="Courier New" w:hint="default"/>
+        <w:sz w:val="20"/>
+      </w:rPr>
+    </w:lvl>
+    <w:lvl w:ilvl="2" w:tentative="1">
+      <w:start w:val="1"/>
+      <w:numFmt w:val="bullet"/>
+      <w:lvlText w:val=""/>
+      <w:lvlJc w:val="left"/>
+      <w:pPr>
+        <w:tabs>
+          <w:tab w:val="num" w:pos="2160"/>
+        </w:tabs>
+        <w:ind w:left="2160" w:hanging="360"/>
+      </w:pPr>
+      <w:rPr>
+        <w:rFonts w:ascii="Wingdings" w:hAnsi="Wingdings" w:hint="default"/>
+        <w:sz w:val="20"/>
+      </w:rPr>
+    </w:lvl>
+    <w:lvl w:ilvl="3" w:tentative="1">
+      <w:start w:val="1"/>
+      <w:numFmt w:val="bullet"/>
+      <w:lvlText w:val=""/>
+      <w:lvlJc w:val="left"/>
+      <w:pPr>
+        <w:tabs>
+          <w:tab w:val="num" w:pos="2880"/>
+        </w:tabs>
+        <w:ind w:left="2880" w:hanging="360"/>
+      </w:pPr>
+      <w:rPr>
+        <w:rFonts w:ascii="Wingdings" w:hAnsi="Wingdings" w:hint="default"/>
+        <w:sz w:val="20"/>
+      </w:rPr>
+    </w:lvl>
+    <w:lvl w:ilvl="4" w:tentative="1">
+      <w:start w:val="1"/>
+      <w:numFmt w:val="bullet"/>
+      <w:lvlText w:val=""/>
+      <w:lvlJc w:val="left"/>
+      <w:pPr>
+        <w:tabs>
+          <w:tab w:val="num" w:pos="3600"/>
+        </w:tabs>
+        <w:ind w:left="3600" w:hanging="360"/>
+      </w:pPr>
+      <w:rPr>
+        <w:rFonts w:ascii="Wingdings" w:hAnsi="Wingdings" w:hint="default"/>
+        <w:sz w:val="20"/>
+      </w:rPr>
+    </w:lvl>
+    <w:lvl w:ilvl="5" w:tentative="1">
+      <w:start w:val="1"/>
+      <w:numFmt w:val="bullet"/>
+      <w:lvlText w:val=""/>
+      <w:lvlJc w:val="left"/>
+      <w:pPr>
+        <w:tabs>
+          <w:tab w:val="num" w:pos="4320"/>
+        </w:tabs>
+        <w:ind w:left="4320" w:hanging="360"/>
+      </w:pPr>
+      <w:rPr>
+        <w:rFonts w:ascii="Wingdings" w:hAnsi="Wingdings" w:hint="default"/>
+        <w:sz w:val="20"/>
+      </w:rPr>
+    </w:lvl>
+    <w:lvl w:ilvl="6" w:tentative="1">
+      <w:start w:val="1"/>
+      <w:numFmt w:val="bullet"/>
+      <w:lvlText w:val=""/>
+      <w:lvlJc w:val="left"/>
+      <w:pPr>
+        <w:tabs>
+          <w:tab w:val="num" w:pos="5040"/>
+        </w:tabs>
+        <w:ind w:left="5040" w:hanging="360"/>
+      </w:pPr>
+      <w:rPr>
+        <w:rFonts w:ascii="Wingdings" w:hAnsi="Wingdings" w:hint="default"/>
+        <w:sz w:val="20"/>
+      </w:rPr>
+    </w:lvl>
+    <w:lvl w:ilvl="7" w:tentative="1">
+      <w:start w:val="1"/>
+      <w:numFmt w:val="bullet"/>
+      <w:lvlText w:val=""/>
+      <w:lvlJc w:val="left"/>
+      <w:pPr>
+        <w:tabs>
+          <w:tab w:val="num" w:pos="5760"/>
+        </w:tabs>
+        <w:ind w:left="5760" w:hanging="360"/>
+      </w:pPr>
+      <w:rPr>
+        <w:rFonts w:ascii="Wingdings" w:hAnsi="Wingdings" w:hint="default"/>
+        <w:sz w:val="20"/>
+      </w:rPr>
+    </w:lvl>
+    <w:lvl w:ilvl="8" w:tentative="1">
+      <w:start w:val="1"/>
+      <w:numFmt w:val="bullet"/>
+      <w:lvlText w:val=""/>
+      <w:lvlJc w:val="left"/>
+      <w:pPr>
+        <w:tabs>
+          <w:tab w:val="num" w:pos="6480"/>
+        </w:tabs>
+        <w:ind w:left="6480" w:hanging="360"/>
+      </w:pPr>
+      <w:rPr>
+        <w:rFonts w:ascii="Wingdings" w:hAnsi="Wingdings" w:hint="default"/>
+        <w:sz w:val="20"/>
+      </w:rPr>
+    </w:lvl>
+  </w:abstractNum>
+  <w:num w:numId="1" w16cid:durableId="2014410565">
+    <w:abstractNumId w:val="0"/>
+  </w:num>
+</w:numbering>
 </file>
 
 <file path=word/styles.xml><?xml version="1.0" encoding="utf-8"?>
@@ -502,6 +3859,7 @@
   <w:style w:type="paragraph" w:default="1" w:styleId="Normal">
     <w:name w:val="Normal"/>
     <w:qFormat/>
+    <w:rsid w:val="008025ED"/>
   </w:style>
   <w:style w:type="paragraph" w:styleId="Heading1">
     <w:name w:val="heading 1"/>
@@ -703,7 +4061,6 @@
   <w:style w:type="character" w:default="1" w:styleId="DefaultParagraphFont">
     <w:name w:val="Default Paragraph Font"/>
     <w:uiPriority w:val="1"/>
-    <w:semiHidden/>
     <w:unhideWhenUsed/>
   </w:style>
   <w:style w:type="table" w:default="1" w:styleId="TableNormal">
@@ -1014,6 +4371,48 @@
       <w:color w:val="0F4761" w:themeColor="accent1" w:themeShade="BF"/>
       <w:spacing w:val="5"/>
     </w:rPr>
+  </w:style>
+  <w:style w:type="character" w:styleId="Hyperlink">
+    <w:name w:val="Hyperlink"/>
+    <w:basedOn w:val="DefaultParagraphFont"/>
+    <w:uiPriority w:val="99"/>
+    <w:unhideWhenUsed/>
+    <w:rsid w:val="005A5F24"/>
+    <w:rPr>
+      <w:color w:val="467886" w:themeColor="hyperlink"/>
+      <w:u w:val="single"/>
+    </w:rPr>
+  </w:style>
+  <w:style w:type="character" w:styleId="UnresolvedMention">
+    <w:name w:val="Unresolved Mention"/>
+    <w:basedOn w:val="DefaultParagraphFont"/>
+    <w:uiPriority w:val="99"/>
+    <w:semiHidden/>
+    <w:unhideWhenUsed/>
+    <w:rsid w:val="005A5F24"/>
+    <w:rPr>
+      <w:color w:val="605E5C"/>
+      <w:shd w:val="clear" w:color="auto" w:fill="E1DFDD"/>
+    </w:rPr>
+  </w:style>
+  <w:style w:type="table" w:styleId="TableGrid">
+    <w:name w:val="Table Grid"/>
+    <w:basedOn w:val="TableNormal"/>
+    <w:uiPriority w:val="39"/>
+    <w:rsid w:val="001A37D3"/>
+    <w:pPr>
+      <w:spacing w:after="0" w:line="240" w:lineRule="auto"/>
+    </w:pPr>
+    <w:tblPr>
+      <w:tblBorders>
+        <w:top w:val="single" w:sz="4" w:space="0" w:color="auto"/>
+        <w:left w:val="single" w:sz="4" w:space="0" w:color="auto"/>
+        <w:bottom w:val="single" w:sz="4" w:space="0" w:color="auto"/>
+        <w:right w:val="single" w:sz="4" w:space="0" w:color="auto"/>
+        <w:insideH w:val="single" w:sz="4" w:space="0" w:color="auto"/>
+        <w:insideV w:val="single" w:sz="4" w:space="0" w:color="auto"/>
+      </w:tblBorders>
+    </w:tblPr>
   </w:style>
 </w:styles>
 </file>

</xml_diff>